<commit_message>
feat: implement ProjectCard component, add project type definitions, and configure experience and project data files
</commit_message>
<xml_diff>
--- a/Mohammed Arif Resume.docx
+++ b/Mohammed Arif Resume.docx
@@ -54,7 +54,27 @@
           <w:szCs w:val="18"/>
           <w:lang w:val="en-US"/>
         </w:rPr>
-        <w:t>Frontend-focused Full-Stack Developer with 1+ year of hands-on experience building scalable web and cross-platform mobile applications. Skilled in React, Next.js, and React Native (Expo), with a strong focus on performance optimization and clean architecture.</w:t>
+        <w:t xml:space="preserve">Frontend-focused </w:t>
+      </w:r>
+      <w:r>
+        <w:rPr>
+          <w:rFonts w:ascii="Nunito" w:eastAsia="Nunito" w:hAnsi="Nunito" w:cs="Nunito"/>
+          <w:color w:val="0F0F0F"/>
+          <w:sz w:val="18"/>
+          <w:szCs w:val="18"/>
+          <w:lang w:val="en-US"/>
+        </w:rPr>
+        <w:t xml:space="preserve">Jr. </w:t>
+      </w:r>
+      <w:r>
+        <w:rPr>
+          <w:rFonts w:ascii="Nunito" w:eastAsia="Nunito" w:hAnsi="Nunito" w:cs="Nunito"/>
+          <w:color w:val="0F0F0F"/>
+          <w:sz w:val="18"/>
+          <w:szCs w:val="18"/>
+          <w:lang w:val="en-US"/>
+        </w:rPr>
+        <w:t>Full-Stack Developer with 1+ year of hands-on experience building scalable web and cross-platform mobile applications. Skilled in React, Next.js, and React Native (Expo), with focus on performance optimization and clean architecture.</w:t>
       </w:r>
     </w:p>
     <w:p>
@@ -87,8 +107,8 @@
         <w:rPr>
           <w:rFonts w:ascii="Nunito" w:eastAsia="Nunito" w:hAnsi="Nunito" w:cs="Nunito"/>
           <w:color w:val="0F0F0F"/>
-          <w:sz w:val="18"/>
-          <w:szCs w:val="18"/>
+          <w:sz w:val="6"/>
+          <w:szCs w:val="6"/>
         </w:rPr>
       </w:pPr>
     </w:p>
@@ -135,14 +155,6 @@
       </w:r>
       <w:r>
         <w:rPr>
-          <w:rFonts w:ascii="Montserrat Thin" w:eastAsia="Montserrat Thin" w:hAnsi="Montserrat Thin" w:cs="Montserrat Thin"/>
-          <w:sz w:val="8"/>
-          <w:szCs w:val="8"/>
-        </w:rPr>
-        <w:br/>
-      </w:r>
-      <w:r>
-        <w:rPr>
           <w:rFonts w:ascii="Nunito ExtraBold" w:eastAsia="Nunito ExtraBold" w:hAnsi="Nunito ExtraBold" w:cs="Nunito ExtraBold"/>
           <w:color w:val="0F0F0F"/>
           <w:sz w:val="18"/>
@@ -175,6 +187,24 @@
           <w:sz w:val="18"/>
           <w:szCs w:val="18"/>
         </w:rPr>
+        <w:t xml:space="preserve">, </w:t>
+      </w:r>
+      <w:r>
+        <w:rPr>
+          <w:rFonts w:ascii="Nunito" w:eastAsia="Nunito" w:hAnsi="Nunito" w:cs="Nunito"/>
+          <w:color w:val="0F0F0F"/>
+          <w:sz w:val="18"/>
+          <w:szCs w:val="18"/>
+        </w:rPr>
+        <w:t>Shadcn/UI, NativeWind</w:t>
+      </w:r>
+      <w:r>
+        <w:rPr>
+          <w:rFonts w:ascii="Nunito" w:eastAsia="Nunito" w:hAnsi="Nunito" w:cs="Nunito"/>
+          <w:color w:val="0F0F0F"/>
+          <w:sz w:val="18"/>
+          <w:szCs w:val="18"/>
+        </w:rPr>
         <w:br/>
       </w:r>
       <w:r>
@@ -195,6 +225,15 @@
         </w:rPr>
         <w:t>Node.js, Express.js, MongoDB, PostgreSQL</w:t>
       </w:r>
+      <w:r>
+        <w:rPr>
+          <w:rFonts w:ascii="Nunito" w:eastAsia="Nunito" w:hAnsi="Nunito" w:cs="Nunito"/>
+          <w:color w:val="0F0F0F"/>
+          <w:sz w:val="18"/>
+          <w:szCs w:val="18"/>
+        </w:rPr>
+        <w:t>, Mongoose, Prisma</w:t>
+      </w:r>
     </w:p>
     <w:p>
       <w:pPr>
@@ -223,7 +262,7 @@
           <w:sz w:val="18"/>
           <w:szCs w:val="18"/>
         </w:rPr>
-        <w:t>React Native (Expo), NativeWind, Firebase, RevenueCat</w:t>
+        <w:t>React Native (Expo), Firebase, RevenueCat</w:t>
       </w:r>
     </w:p>
     <w:p>
@@ -272,8 +311,8 @@
         <w:rPr>
           <w:rFonts w:ascii="Nunito" w:eastAsia="Nunito" w:hAnsi="Nunito" w:cs="Nunito"/>
           <w:color w:val="0F0F0F"/>
-          <w:sz w:val="18"/>
-          <w:szCs w:val="18"/>
+          <w:sz w:val="10"/>
+          <w:szCs w:val="10"/>
         </w:rPr>
       </w:pPr>
     </w:p>
@@ -282,9 +321,11 @@
         <w:spacing w:line="240" w:lineRule="auto"/>
         <w:ind w:left="-270"/>
         <w:rPr>
-          <w:rFonts w:ascii="Nunito" w:eastAsia="Nunito" w:hAnsi="Nunito" w:cs="Nunito"/>
-          <w:sz w:val="18"/>
-          <w:szCs w:val="18"/>
+          <w:rFonts w:ascii="Montserrat" w:eastAsia="Montserrat" w:hAnsi="Montserrat" w:cs="Montserrat"/>
+          <w:b/>
+          <w:bCs/>
+          <w:sz w:val="4"/>
+          <w:szCs w:val="4"/>
         </w:rPr>
       </w:pPr>
       <w:r>
@@ -318,6 +359,17 @@
         </w:rPr>
         <w:br/>
       </w:r>
+    </w:p>
+    <w:p>
+      <w:pPr>
+        <w:spacing w:line="240" w:lineRule="auto"/>
+        <w:ind w:left="-270"/>
+        <w:rPr>
+          <w:rFonts w:ascii="Nunito" w:eastAsia="Nunito" w:hAnsi="Nunito" w:cs="Nunito"/>
+          <w:sz w:val="18"/>
+          <w:szCs w:val="18"/>
+        </w:rPr>
+      </w:pPr>
       <w:r>
         <w:rPr>
           <w:rFonts w:ascii="Montserrat" w:eastAsia="Montserrat" w:hAnsi="Montserrat" w:cs="Montserrat"/>
@@ -353,46 +405,20 @@
           <w:rFonts w:ascii="Nunito" w:eastAsia="Nunito" w:hAnsi="Nunito" w:cs="Nunito"/>
           <w:b/>
           <w:bCs/>
-          <w:i/>
-          <w:iCs/>
-          <w:sz w:val="16"/>
-          <w:szCs w:val="16"/>
-        </w:rPr>
-        <w:t>Frontend</w:t>
-      </w:r>
-      <w:r>
-        <w:rPr>
-          <w:rFonts w:ascii="Nunito" w:eastAsia="Nunito" w:hAnsi="Nunito" w:cs="Nunito"/>
-          <w:b/>
-          <w:bCs/>
-          <w:i/>
-          <w:iCs/>
-          <w:sz w:val="16"/>
-          <w:szCs w:val="16"/>
-        </w:rPr>
-        <w:t xml:space="preserve"> </w:t>
-      </w:r>
-      <w:r>
-        <w:rPr>
-          <w:rFonts w:ascii="Nunito" w:eastAsia="Nunito" w:hAnsi="Nunito" w:cs="Nunito"/>
-          <w:b/>
-          <w:bCs/>
-          <w:i/>
-          <w:iCs/>
-          <w:sz w:val="16"/>
-          <w:szCs w:val="16"/>
-        </w:rPr>
-        <w:t xml:space="preserve">Developer </w:t>
-      </w:r>
-      <w:r>
-        <w:rPr>
-          <w:rFonts w:ascii="Nunito" w:eastAsia="Nunito" w:hAnsi="Nunito" w:cs="Nunito"/>
-          <w:b/>
-          <w:bCs/>
-          <w:sz w:val="16"/>
-          <w:szCs w:val="16"/>
-        </w:rPr>
-        <w:t xml:space="preserve">                                                                                                                                             </w:t>
+          <w:sz w:val="18"/>
+          <w:szCs w:val="18"/>
+        </w:rPr>
+        <w:t xml:space="preserve">Frontend </w:t>
+      </w:r>
+      <w:r>
+        <w:rPr>
+          <w:rFonts w:ascii="Nunito" w:eastAsia="Nunito" w:hAnsi="Nunito" w:cs="Nunito"/>
+          <w:b/>
+          <w:bCs/>
+          <w:sz w:val="18"/>
+          <w:szCs w:val="18"/>
+        </w:rPr>
+        <w:t xml:space="preserve">Developer                                                                                                                                              </w:t>
       </w:r>
       <w:r>
         <w:rPr>
@@ -439,15 +465,15 @@
           <w:rFonts w:ascii="Nunito" w:eastAsia="Nunito" w:hAnsi="Nunito" w:cs="Nunito"/>
           <w:b/>
           <w:bCs/>
-          <w:sz w:val="18"/>
-          <w:szCs w:val="18"/>
-        </w:rPr>
-      </w:pPr>
-      <w:r>
-        <w:rPr>
-          <w:rFonts w:ascii="Nunito" w:eastAsia="Nunito" w:hAnsi="Nunito" w:cs="Nunito"/>
-          <w:sz w:val="18"/>
-          <w:szCs w:val="18"/>
+          <w:sz w:val="16"/>
+          <w:szCs w:val="16"/>
+        </w:rPr>
+      </w:pPr>
+      <w:r>
+        <w:rPr>
+          <w:rFonts w:ascii="Nunito" w:eastAsia="Nunito" w:hAnsi="Nunito" w:cs="Nunito"/>
+          <w:sz w:val="16"/>
+          <w:szCs w:val="16"/>
         </w:rPr>
         <w:t>Integrating an AI-related API Endpoint, collaborated with backend developers for seamless API integrations.</w:t>
       </w:r>
@@ -463,15 +489,15 @@
         <w:jc w:val="both"/>
         <w:rPr>
           <w:rFonts w:ascii="Nunito" w:eastAsia="Nunito" w:hAnsi="Nunito" w:cs="Nunito"/>
-          <w:sz w:val="18"/>
-          <w:szCs w:val="18"/>
-        </w:rPr>
-      </w:pPr>
-      <w:r>
-        <w:rPr>
-          <w:rFonts w:ascii="Nunito" w:eastAsia="Nunito" w:hAnsi="Nunito" w:cs="Nunito"/>
-          <w:sz w:val="18"/>
-          <w:szCs w:val="18"/>
+          <w:sz w:val="16"/>
+          <w:szCs w:val="16"/>
+        </w:rPr>
+      </w:pPr>
+      <w:r>
+        <w:rPr>
+          <w:rFonts w:ascii="Nunito" w:eastAsia="Nunito" w:hAnsi="Nunito" w:cs="Nunito"/>
+          <w:sz w:val="16"/>
+          <w:szCs w:val="16"/>
         </w:rPr>
         <w:t xml:space="preserve">Meeting with Foreign Clients, gathering information, and requirements. </w:t>
       </w:r>
@@ -489,15 +515,15 @@
           <w:rFonts w:ascii="Nunito" w:eastAsia="Nunito" w:hAnsi="Nunito" w:cs="Nunito"/>
           <w:b/>
           <w:bCs/>
-          <w:sz w:val="18"/>
-          <w:szCs w:val="18"/>
-        </w:rPr>
-      </w:pPr>
-      <w:r>
-        <w:rPr>
-          <w:rFonts w:ascii="Nunito" w:eastAsia="Nunito" w:hAnsi="Nunito" w:cs="Nunito"/>
-          <w:sz w:val="18"/>
-          <w:szCs w:val="18"/>
+          <w:sz w:val="16"/>
+          <w:szCs w:val="16"/>
+        </w:rPr>
+      </w:pPr>
+      <w:r>
+        <w:rPr>
+          <w:rFonts w:ascii="Nunito" w:eastAsia="Nunito" w:hAnsi="Nunito" w:cs="Nunito"/>
+          <w:sz w:val="16"/>
+          <w:szCs w:val="16"/>
         </w:rPr>
         <w:t xml:space="preserve">Building and maintaining AI web applications, like AI Web tools. </w:t>
       </w:r>
@@ -513,31 +539,31 @@
         <w:jc w:val="both"/>
         <w:rPr>
           <w:rFonts w:ascii="Nunito" w:eastAsia="Nunito" w:hAnsi="Nunito" w:cs="Nunito"/>
-          <w:sz w:val="18"/>
-          <w:szCs w:val="18"/>
-        </w:rPr>
-      </w:pPr>
-      <w:r>
-        <w:rPr>
-          <w:rFonts w:ascii="Nunito" w:eastAsia="Nunito" w:hAnsi="Nunito" w:cs="Nunito"/>
-          <w:sz w:val="18"/>
-          <w:szCs w:val="18"/>
+          <w:sz w:val="16"/>
+          <w:szCs w:val="16"/>
+        </w:rPr>
+      </w:pPr>
+      <w:r>
+        <w:rPr>
+          <w:rFonts w:ascii="Nunito" w:eastAsia="Nunito" w:hAnsi="Nunito" w:cs="Nunito"/>
+          <w:sz w:val="16"/>
+          <w:szCs w:val="16"/>
         </w:rPr>
         <w:t xml:space="preserve">Completed </w:t>
       </w:r>
       <w:r>
         <w:rPr>
           <w:rFonts w:ascii="Nunito" w:eastAsia="Nunito" w:hAnsi="Nunito" w:cs="Nunito"/>
-          <w:sz w:val="18"/>
-          <w:szCs w:val="18"/>
+          <w:sz w:val="16"/>
+          <w:szCs w:val="16"/>
         </w:rPr>
         <w:t>5</w:t>
       </w:r>
       <w:r>
         <w:rPr>
           <w:rFonts w:ascii="Nunito" w:eastAsia="Nunito" w:hAnsi="Nunito" w:cs="Nunito"/>
-          <w:sz w:val="18"/>
-          <w:szCs w:val="18"/>
+          <w:sz w:val="16"/>
+          <w:szCs w:val="16"/>
         </w:rPr>
         <w:t xml:space="preserve">+ Client projects and fixed performance optimization and bugs. </w:t>
       </w:r>
@@ -553,15 +579,15 @@
         <w:jc w:val="both"/>
         <w:rPr>
           <w:rFonts w:ascii="Nunito" w:eastAsia="Nunito" w:hAnsi="Nunito" w:cs="Nunito"/>
-          <w:sz w:val="18"/>
-          <w:szCs w:val="18"/>
-        </w:rPr>
-      </w:pPr>
-      <w:r>
-        <w:rPr>
-          <w:rFonts w:ascii="Nunito" w:eastAsia="Nunito" w:hAnsi="Nunito" w:cs="Nunito"/>
-          <w:sz w:val="18"/>
-          <w:szCs w:val="18"/>
+          <w:sz w:val="16"/>
+          <w:szCs w:val="16"/>
+        </w:rPr>
+      </w:pPr>
+      <w:r>
+        <w:rPr>
+          <w:rFonts w:ascii="Nunito" w:eastAsia="Nunito" w:hAnsi="Nunito" w:cs="Nunito"/>
+          <w:sz w:val="16"/>
+          <w:szCs w:val="16"/>
         </w:rPr>
         <w:t xml:space="preserve"> maintained </w:t>
       </w:r>
@@ -570,30 +596,19 @@
           <w:rFonts w:ascii="Nunito" w:eastAsia="Nunito" w:hAnsi="Nunito" w:cs="Nunito"/>
           <w:b/>
           <w:bCs/>
-          <w:sz w:val="18"/>
-          <w:szCs w:val="18"/>
+          <w:sz w:val="16"/>
+          <w:szCs w:val="16"/>
         </w:rPr>
         <w:t xml:space="preserve">W3C </w:t>
       </w:r>
       <w:r>
         <w:rPr>
           <w:rFonts w:ascii="Nunito" w:eastAsia="Nunito" w:hAnsi="Nunito" w:cs="Nunito"/>
-          <w:sz w:val="18"/>
-          <w:szCs w:val="18"/>
+          <w:sz w:val="16"/>
+          <w:szCs w:val="16"/>
         </w:rPr>
         <w:t>standards and addressed browser compatibility issues.</w:t>
       </w:r>
-    </w:p>
-    <w:p>
-      <w:pPr>
-        <w:spacing w:line="240" w:lineRule="auto"/>
-        <w:ind w:left="-270"/>
-        <w:rPr>
-          <w:rFonts w:ascii="Montserrat Thin" w:eastAsia="Montserrat Thin" w:hAnsi="Montserrat Thin" w:cs="Montserrat Thin"/>
-          <w:sz w:val="8"/>
-          <w:szCs w:val="8"/>
-        </w:rPr>
-      </w:pPr>
     </w:p>
     <w:p>
       <w:pPr>
@@ -624,7 +639,7 @@
           <w:sz w:val="18"/>
           <w:szCs w:val="18"/>
         </w:rPr>
-        <w:t>cross-platform</w:t>
+        <w:t>Cross-Platform App Developer</w:t>
       </w:r>
       <w:r>
         <w:rPr>
@@ -636,7 +651,7 @@
           <w:sz w:val="16"/>
           <w:szCs w:val="16"/>
         </w:rPr>
-        <w:t xml:space="preserve"> App </w:t>
+        <w:tab/>
       </w:r>
       <w:r>
         <w:rPr>
@@ -648,72 +663,28 @@
           <w:sz w:val="16"/>
           <w:szCs w:val="16"/>
         </w:rPr>
-        <w:t>Developer</w:t>
-      </w:r>
-      <w:r>
-        <w:rPr>
-          <w:rFonts w:ascii="Nunito" w:eastAsia="Nunito" w:hAnsi="Nunito" w:cs="Nunito"/>
-          <w:b/>
-          <w:bCs/>
+        <w:tab/>
+        <w:t xml:space="preserve">             </w:t>
+      </w:r>
+      <w:r>
+        <w:rPr>
+          <w:rFonts w:ascii="Nunito" w:eastAsia="Nunito" w:hAnsi="Nunito" w:cs="Nunito"/>
+          <w:b/>
+          <w:bCs/>
+          <w:sz w:val="16"/>
+          <w:szCs w:val="16"/>
+        </w:rPr>
+        <w:t xml:space="preserve">                                                                                                                    </w:t>
+      </w:r>
+      <w:r>
+        <w:rPr>
+          <w:rFonts w:ascii="Nunito" w:eastAsia="Nunito" w:hAnsi="Nunito" w:cs="Nunito"/>
           <w:i/>
           <w:iCs/>
           <w:sz w:val="16"/>
           <w:szCs w:val="16"/>
         </w:rPr>
-        <w:tab/>
-      </w:r>
-      <w:r>
-        <w:rPr>
-          <w:rFonts w:ascii="Nunito" w:eastAsia="Nunito" w:hAnsi="Nunito" w:cs="Nunito"/>
-          <w:b/>
-          <w:bCs/>
-          <w:i/>
-          <w:iCs/>
-          <w:sz w:val="16"/>
-          <w:szCs w:val="16"/>
-        </w:rPr>
-        <w:tab/>
-        <w:t xml:space="preserve">             </w:t>
-      </w:r>
-      <w:r>
-        <w:rPr>
-          <w:rFonts w:ascii="Nunito" w:eastAsia="Nunito" w:hAnsi="Nunito" w:cs="Nunito"/>
-          <w:b/>
-          <w:bCs/>
-          <w:sz w:val="16"/>
-          <w:szCs w:val="16"/>
-        </w:rPr>
-        <w:t xml:space="preserve">                                                                                                                                    </w:t>
-      </w:r>
-      <w:r>
-        <w:rPr>
-          <w:rFonts w:ascii="Nunito" w:eastAsia="Nunito" w:hAnsi="Nunito" w:cs="Nunito"/>
-          <w:i/>
-          <w:iCs/>
-          <w:sz w:val="16"/>
-          <w:szCs w:val="16"/>
-        </w:rPr>
-        <w:t>December</w:t>
-      </w:r>
-      <w:r>
-        <w:rPr>
-          <w:rFonts w:ascii="Nunito" w:eastAsia="Nunito" w:hAnsi="Nunito" w:cs="Nunito"/>
-          <w:i/>
-          <w:iCs/>
-          <w:sz w:val="16"/>
-          <w:szCs w:val="16"/>
-        </w:rPr>
-        <w:t xml:space="preserve"> 2025 - </w:t>
-      </w:r>
-      <w:r>
-        <w:rPr>
-          <w:rFonts w:ascii="Nunito" w:eastAsia="Nunito" w:hAnsi="Nunito" w:cs="Nunito"/>
-          <w:i/>
-          <w:iCs/>
-          <w:sz w:val="16"/>
-          <w:szCs w:val="16"/>
-        </w:rPr>
-        <w:t>Present</w:t>
+        <w:t>December 2025 - Present</w:t>
       </w:r>
     </w:p>
     <w:p>
@@ -727,19 +698,17 @@
         <w:jc w:val="both"/>
         <w:rPr>
           <w:rFonts w:ascii="Nunito" w:eastAsia="Nunito" w:hAnsi="Nunito" w:cs="Nunito"/>
-          <w:b/>
-          <w:bCs/>
-          <w:sz w:val="18"/>
-          <w:szCs w:val="18"/>
-        </w:rPr>
-      </w:pPr>
-      <w:r>
-        <w:rPr>
-          <w:rFonts w:ascii="Nunito" w:eastAsia="Nunito" w:hAnsi="Nunito" w:cs="Nunito"/>
-          <w:sz w:val="18"/>
-          <w:szCs w:val="18"/>
-        </w:rPr>
-        <w:t>Analyzed performance metrics to identify bottlenecks and refactored legacy front-end code for improved speed, scalability</w:t>
+          <w:sz w:val="16"/>
+          <w:szCs w:val="16"/>
+        </w:rPr>
+      </w:pPr>
+      <w:r>
+        <w:rPr>
+          <w:rFonts w:ascii="Nunito" w:eastAsia="Nunito" w:hAnsi="Nunito" w:cs="Nunito"/>
+          <w:sz w:val="16"/>
+          <w:szCs w:val="16"/>
+        </w:rPr>
+        <w:t>Developed and maintained cross-platform mobile applications using React Native (Expo).</w:t>
       </w:r>
     </w:p>
     <w:p>
@@ -753,17 +722,17 @@
         <w:jc w:val="both"/>
         <w:rPr>
           <w:rFonts w:ascii="Nunito" w:eastAsia="Nunito" w:hAnsi="Nunito" w:cs="Nunito"/>
-          <w:sz w:val="18"/>
-          <w:szCs w:val="18"/>
-        </w:rPr>
-      </w:pPr>
-      <w:r>
-        <w:rPr>
-          <w:rFonts w:ascii="Nunito" w:eastAsia="Nunito" w:hAnsi="Nunito" w:cs="Nunito"/>
-          <w:sz w:val="18"/>
-          <w:szCs w:val="18"/>
-        </w:rPr>
-        <w:t>Improving query caching, revalidation. Implemented quality-of-service and performance.</w:t>
+          <w:sz w:val="16"/>
+          <w:szCs w:val="16"/>
+        </w:rPr>
+      </w:pPr>
+      <w:r>
+        <w:rPr>
+          <w:rFonts w:ascii="Nunito" w:eastAsia="Nunito" w:hAnsi="Nunito" w:cs="Nunito"/>
+          <w:sz w:val="16"/>
+          <w:szCs w:val="16"/>
+        </w:rPr>
+        <w:t>Integrated third-party services and SDKs including Firebase, RevenueCat, authentication systems, analytics, and payment-related services.</w:t>
       </w:r>
     </w:p>
     <w:p>
@@ -777,17 +746,17 @@
         <w:jc w:val="both"/>
         <w:rPr>
           <w:rFonts w:ascii="Nunito" w:eastAsia="Nunito" w:hAnsi="Nunito" w:cs="Nunito"/>
-          <w:sz w:val="18"/>
-          <w:szCs w:val="18"/>
-        </w:rPr>
-      </w:pPr>
-      <w:r>
-        <w:rPr>
-          <w:rFonts w:ascii="Nunito" w:eastAsia="Nunito" w:hAnsi="Nunito" w:cs="Nunito"/>
-          <w:sz w:val="18"/>
-          <w:szCs w:val="18"/>
-        </w:rPr>
-        <w:t>Optimized client projects to consistently achieve a Lighthouse score of 90+ whenever feasible</w:t>
+          <w:sz w:val="16"/>
+          <w:szCs w:val="16"/>
+        </w:rPr>
+      </w:pPr>
+      <w:r>
+        <w:rPr>
+          <w:rFonts w:ascii="Nunito" w:eastAsia="Nunito" w:hAnsi="Nunito" w:cs="Nunito"/>
+          <w:sz w:val="16"/>
+          <w:szCs w:val="16"/>
+        </w:rPr>
+        <w:t>Managed complete app deployment workflows for both Google Play Store and Apple App Store, including builds, testing, submission, and release updates.</w:t>
       </w:r>
     </w:p>
     <w:p>
@@ -801,29 +770,42 @@
         <w:jc w:val="both"/>
         <w:rPr>
           <w:rFonts w:ascii="Nunito" w:eastAsia="Nunito" w:hAnsi="Nunito" w:cs="Nunito"/>
-          <w:sz w:val="18"/>
-          <w:szCs w:val="18"/>
-        </w:rPr>
-      </w:pPr>
-      <w:r>
-        <w:rPr>
-          <w:rFonts w:ascii="Nunito" w:eastAsia="Nunito" w:hAnsi="Nunito" w:cs="Nunito"/>
-          <w:sz w:val="18"/>
-          <w:szCs w:val="18"/>
-        </w:rPr>
-        <w:t xml:space="preserve">Fixed unnecessary re-rendering and client-side error handling, removed unnecessary packages with custom logic or more stable alternatives, and improved Lighthouse score by 10-20%. </w:t>
-      </w:r>
-    </w:p>
-    <w:p>
-      <w:pPr>
-        <w:spacing w:line="240" w:lineRule="auto"/>
+          <w:sz w:val="16"/>
+          <w:szCs w:val="16"/>
+        </w:rPr>
+      </w:pPr>
+      <w:r>
+        <w:rPr>
+          <w:rFonts w:ascii="Nunito" w:eastAsia="Nunito" w:hAnsi="Nunito" w:cs="Nunito"/>
+          <w:sz w:val="16"/>
+          <w:szCs w:val="16"/>
+        </w:rPr>
+        <w:t>Built reusable and scalable mobile UI components while maintaining clean and modular code architecture.</w:t>
+      </w:r>
+    </w:p>
+    <w:p>
+      <w:pPr>
+        <w:numPr>
+          <w:ilvl w:val="0"/>
+          <w:numId w:val="2"/>
+        </w:numPr>
+        <w:spacing w:line="240" w:lineRule="auto"/>
+        <w:ind w:left="-90" w:hanging="180"/>
         <w:jc w:val="both"/>
         <w:rPr>
           <w:rFonts w:ascii="Nunito" w:eastAsia="Nunito" w:hAnsi="Nunito" w:cs="Nunito"/>
-          <w:sz w:val="8"/>
-          <w:szCs w:val="8"/>
-        </w:rPr>
-      </w:pPr>
+          <w:sz w:val="16"/>
+          <w:szCs w:val="16"/>
+        </w:rPr>
+      </w:pPr>
+      <w:r>
+        <w:rPr>
+          <w:rFonts w:ascii="Nunito" w:eastAsia="Nunito" w:hAnsi="Nunito" w:cs="Nunito"/>
+          <w:sz w:val="16"/>
+          <w:szCs w:val="16"/>
+        </w:rPr>
+        <w:t>Worked with Expo/EAS Build, environment configurations, OTA updates, and platform-specific debugging for Android and iOS.</w:t>
+      </w:r>
     </w:p>
     <w:p>
       <w:pPr>
@@ -833,8 +815,8 @@
           <w:rFonts w:ascii="Nunito" w:eastAsia="Nunito" w:hAnsi="Nunito" w:cs="Nunito"/>
           <w:i/>
           <w:iCs/>
-          <w:sz w:val="16"/>
-          <w:szCs w:val="16"/>
+          <w:sz w:val="14"/>
+          <w:szCs w:val="14"/>
         </w:rPr>
       </w:pPr>
     </w:p>
@@ -885,9 +867,26 @@
         <w:spacing w:line="240" w:lineRule="auto"/>
         <w:ind w:left="-270"/>
         <w:rPr>
-          <w:rFonts w:ascii="Nunito" w:eastAsia="Nunito" w:hAnsi="Nunito" w:cs="Nunito"/>
-          <w:sz w:val="18"/>
-          <w:szCs w:val="18"/>
+          <w:rFonts w:ascii="Montserrat" w:eastAsia="Montserrat" w:hAnsi="Montserrat" w:cs="Montserrat"/>
+          <w:b/>
+          <w:bCs/>
+          <w:sz w:val="4"/>
+          <w:szCs w:val="4"/>
+        </w:rPr>
+      </w:pPr>
+    </w:p>
+    <w:p>
+      <w:pPr>
+        <w:spacing w:line="240" w:lineRule="auto"/>
+        <w:ind w:left="-270"/>
+        <w:rPr>
+          <w:rFonts w:ascii="Nunito" w:eastAsia="Nunito" w:hAnsi="Nunito" w:cs="Nunito"/>
+          <w:b/>
+          <w:bCs/>
+          <w:color w:val="1155CC"/>
+          <w:sz w:val="18"/>
+          <w:szCs w:val="18"/>
+          <w:u w:val="single"/>
         </w:rPr>
       </w:pPr>
       <w:r>
@@ -898,33 +897,301 @@
           <w:sz w:val="20"/>
           <w:szCs w:val="20"/>
         </w:rPr>
-        <w:t>Korma App</w:t>
-      </w:r>
-      <w:r>
+        <w:t xml:space="preserve">Floruit </w:t>
+      </w:r>
+      <w:r>
+        <w:rPr>
+          <w:rFonts w:ascii="Montserrat" w:eastAsia="Montserrat" w:hAnsi="Montserrat" w:cs="Montserrat"/>
+          <w:b/>
+          <w:bCs/>
+          <w:sz w:val="20"/>
+          <w:szCs w:val="20"/>
+        </w:rPr>
+        <w:t>(</w:t>
+      </w:r>
+      <w:r>
+        <w:rPr>
+          <w:rFonts w:ascii="Montserrat" w:eastAsia="Montserrat" w:hAnsi="Montserrat" w:cs="Montserrat"/>
+          <w:b/>
+          <w:bCs/>
+          <w:sz w:val="20"/>
+          <w:szCs w:val="20"/>
+        </w:rPr>
+        <w:t>Co-Parenting Mobile Ap</w:t>
+      </w:r>
+      <w:r>
+        <w:rPr>
+          <w:rFonts w:ascii="Montserrat" w:eastAsia="Montserrat" w:hAnsi="Montserrat" w:cs="Montserrat"/>
+          <w:b/>
+          <w:bCs/>
+          <w:sz w:val="20"/>
+          <w:szCs w:val="20"/>
+        </w:rPr>
+        <w:t>p)</w:t>
+      </w:r>
+      <w:r>
+        <w:rPr>
+          <w:rFonts w:ascii="Nunito" w:eastAsia="Nunito" w:hAnsi="Nunito" w:cs="Nunito"/>
+          <w:b/>
+          <w:bCs/>
+          <w:sz w:val="16"/>
+          <w:szCs w:val="16"/>
+        </w:rPr>
+        <w:tab/>
+      </w:r>
+    </w:p>
+    <w:p>
+      <w:pPr>
+        <w:spacing w:line="240" w:lineRule="auto"/>
+        <w:ind w:left="-270"/>
+        <w:rPr>
+          <w:rFonts w:ascii="Nunito" w:eastAsia="Nunito" w:hAnsi="Nunito" w:cs="Nunito"/>
+          <w:sz w:val="6"/>
+          <w:szCs w:val="6"/>
+        </w:rPr>
+      </w:pPr>
+    </w:p>
+    <w:p>
+      <w:pPr>
+        <w:numPr>
+          <w:ilvl w:val="0"/>
+          <w:numId w:val="1"/>
+        </w:numPr>
+        <w:spacing w:line="240" w:lineRule="auto"/>
+        <w:ind w:left="-90" w:hanging="180"/>
+        <w:jc w:val="both"/>
+        <w:rPr>
+          <w:rFonts w:ascii="Nunito" w:eastAsia="Nunito" w:hAnsi="Nunito" w:cs="Nunito"/>
+          <w:sz w:val="16"/>
+          <w:szCs w:val="16"/>
+        </w:rPr>
+      </w:pPr>
+      <w:r>
+        <w:rPr>
+          <w:rFonts w:ascii="Nunito" w:eastAsia="Nunito" w:hAnsi="Nunito" w:cs="Nunito"/>
+          <w:sz w:val="16"/>
+          <w:szCs w:val="16"/>
+        </w:rPr>
+        <w:t>Developed and maintained a production-ready cross-platform co-parenting mobile application for Android and iOS.</w:t>
+      </w:r>
+    </w:p>
+    <w:p>
+      <w:pPr>
+        <w:numPr>
+          <w:ilvl w:val="0"/>
+          <w:numId w:val="1"/>
+        </w:numPr>
+        <w:spacing w:line="240" w:lineRule="auto"/>
+        <w:ind w:left="-90" w:hanging="180"/>
+        <w:jc w:val="both"/>
+        <w:rPr>
+          <w:rFonts w:ascii="Nunito" w:eastAsia="Nunito" w:hAnsi="Nunito" w:cs="Nunito"/>
+          <w:sz w:val="16"/>
+          <w:szCs w:val="16"/>
+        </w:rPr>
+      </w:pPr>
+      <w:r>
+        <w:rPr>
+          <w:rFonts w:ascii="Nunito" w:eastAsia="Nunito" w:hAnsi="Nunito" w:cs="Nunito"/>
+          <w:sz w:val="16"/>
+          <w:szCs w:val="16"/>
+        </w:rPr>
+        <w:t>Integrated authentication, subscription systems, push notifications, real-time messaging, and third-party services.</w:t>
+      </w:r>
+    </w:p>
+    <w:p>
+      <w:pPr>
+        <w:numPr>
+          <w:ilvl w:val="0"/>
+          <w:numId w:val="1"/>
+        </w:numPr>
+        <w:spacing w:line="240" w:lineRule="auto"/>
+        <w:ind w:left="-90" w:hanging="180"/>
+        <w:jc w:val="both"/>
+        <w:rPr>
+          <w:rFonts w:ascii="Nunito" w:eastAsia="Nunito" w:hAnsi="Nunito" w:cs="Nunito"/>
+          <w:sz w:val="16"/>
+          <w:szCs w:val="16"/>
+        </w:rPr>
+      </w:pPr>
+      <w:r>
+        <w:rPr>
+          <w:rFonts w:ascii="Nunito" w:eastAsia="Nunito" w:hAnsi="Nunito" w:cs="Nunito"/>
+          <w:sz w:val="16"/>
+          <w:szCs w:val="16"/>
+        </w:rPr>
+        <w:t xml:space="preserve">Managed Play Store and App Store deployment workflows, including builds, testing, updates, and release management. </w:t>
+      </w:r>
+    </w:p>
+    <w:p>
+      <w:pPr>
+        <w:numPr>
+          <w:ilvl w:val="0"/>
+          <w:numId w:val="1"/>
+        </w:numPr>
+        <w:spacing w:line="240" w:lineRule="auto"/>
+        <w:ind w:left="-90" w:hanging="180"/>
+        <w:jc w:val="both"/>
+        <w:rPr>
+          <w:rFonts w:ascii="Nunito" w:eastAsia="Nunito" w:hAnsi="Nunito" w:cs="Nunito"/>
+          <w:sz w:val="16"/>
+          <w:szCs w:val="16"/>
+        </w:rPr>
+      </w:pPr>
+      <w:r>
+        <w:rPr>
+          <w:rFonts w:ascii="Nunito" w:eastAsia="Nunito" w:hAnsi="Nunito" w:cs="Nunito"/>
+          <w:sz w:val="16"/>
+          <w:szCs w:val="16"/>
+        </w:rPr>
+        <w:t>Built scalable mobile UI components and handled complex state management using Redux Toolkit.</w:t>
+      </w:r>
+    </w:p>
+    <w:p>
+      <w:pPr>
+        <w:numPr>
+          <w:ilvl w:val="0"/>
+          <w:numId w:val="1"/>
+        </w:numPr>
+        <w:spacing w:line="240" w:lineRule="auto"/>
+        <w:ind w:left="-90" w:hanging="180"/>
+        <w:jc w:val="both"/>
+        <w:rPr>
+          <w:rFonts w:ascii="Nunito" w:eastAsia="Nunito" w:hAnsi="Nunito" w:cs="Nunito"/>
+          <w:sz w:val="16"/>
+          <w:szCs w:val="16"/>
+        </w:rPr>
+      </w:pPr>
+      <w:r>
+        <w:rPr>
+          <w:rFonts w:ascii="Nunito" w:eastAsia="Nunito" w:hAnsi="Nunito" w:cs="Nunito"/>
+          <w:sz w:val="16"/>
+          <w:szCs w:val="16"/>
+        </w:rPr>
+        <w:t xml:space="preserve">Following the neo-brutalism design trend and creating a retro design </w:t>
+      </w:r>
+    </w:p>
+    <w:p>
+      <w:pPr>
+        <w:numPr>
+          <w:ilvl w:val="0"/>
+          <w:numId w:val="1"/>
+        </w:numPr>
+        <w:spacing w:line="240" w:lineRule="auto"/>
+        <w:ind w:left="-90" w:hanging="180"/>
+        <w:jc w:val="both"/>
+        <w:rPr>
+          <w:rFonts w:ascii="Nunito" w:eastAsia="Nunito" w:hAnsi="Nunito" w:cs="Nunito"/>
+          <w:sz w:val="16"/>
+          <w:szCs w:val="16"/>
+        </w:rPr>
+      </w:pPr>
+      <w:r>
+        <w:rPr>
+          <w:rFonts w:ascii="Nunito" w:eastAsia="Nunito" w:hAnsi="Nunito" w:cs="Nunito"/>
+          <w:sz w:val="16"/>
+          <w:szCs w:val="16"/>
+        </w:rPr>
+        <w:t>Collaborated with backend developers for API integration, chat systems, and real-time application features.</w:t>
+      </w:r>
+      <w:r>
+        <w:rPr>
+          <w:rFonts w:ascii="Nunito" w:eastAsia="Nunito" w:hAnsi="Nunito" w:cs="Nunito"/>
+          <w:sz w:val="18"/>
+          <w:szCs w:val="18"/>
+        </w:rPr>
+        <w:t xml:space="preserve"> </w:t>
+      </w:r>
+    </w:p>
+    <w:p>
+      <w:pPr>
+        <w:numPr>
+          <w:ilvl w:val="0"/>
+          <w:numId w:val="1"/>
+        </w:numPr>
+        <w:spacing w:line="240" w:lineRule="auto"/>
+        <w:ind w:left="-90" w:hanging="180"/>
+        <w:jc w:val="both"/>
+        <w:rPr>
+          <w:rFonts w:ascii="Nunito" w:eastAsia="Nunito" w:hAnsi="Nunito" w:cs="Nunito"/>
+          <w:sz w:val="16"/>
+          <w:szCs w:val="16"/>
+        </w:rPr>
+      </w:pPr>
+      <w:r>
+        <w:rPr>
+          <w:rFonts w:ascii="Nunito" w:eastAsia="Nunito" w:hAnsi="Nunito" w:cs="Nunito"/>
+          <w:sz w:val="16"/>
+          <w:szCs w:val="16"/>
+        </w:rPr>
+        <w:t>Worked with Expo/EAS Build, environment configurations, OTA updates, and platform-specific debugging.</w:t>
+      </w:r>
+    </w:p>
+    <w:p>
+      <w:pPr>
+        <w:spacing w:line="240" w:lineRule="auto"/>
+        <w:ind w:left="-90"/>
+        <w:jc w:val="both"/>
+        <w:rPr>
+          <w:rFonts w:ascii="Nunito" w:eastAsia="Nunito" w:hAnsi="Nunito" w:cs="Nunito"/>
+          <w:sz w:val="6"/>
+          <w:szCs w:val="6"/>
+        </w:rPr>
+      </w:pPr>
+    </w:p>
+    <w:p>
+      <w:pPr>
+        <w:spacing w:line="240" w:lineRule="auto"/>
+        <w:ind w:left="-270"/>
+        <w:jc w:val="both"/>
         <w:rPr>
           <w:rFonts w:ascii="Nunito SemiBold" w:eastAsia="Nunito SemiBold" w:hAnsi="Nunito SemiBold" w:cs="Nunito SemiBold"/>
           <w:sz w:val="16"/>
           <w:szCs w:val="16"/>
         </w:rPr>
-        <w:br/>
-      </w:r>
-      <w:r>
-        <w:rPr>
-          <w:rFonts w:ascii="Nunito" w:eastAsia="Nunito" w:hAnsi="Nunito" w:cs="Nunito"/>
-          <w:b/>
-          <w:bCs/>
-          <w:sz w:val="16"/>
-          <w:szCs w:val="16"/>
+      </w:pPr>
+      <w:r>
+        <w:rPr>
+          <w:rFonts w:ascii="Nunito" w:eastAsia="Nunito" w:hAnsi="Nunito" w:cs="Nunito"/>
+          <w:b/>
+          <w:bCs/>
+          <w:sz w:val="18"/>
+          <w:szCs w:val="18"/>
         </w:rPr>
         <w:t>Technology</w:t>
       </w:r>
       <w:r>
         <w:rPr>
           <w:rFonts w:ascii="Nunito SemiBold" w:eastAsia="Nunito SemiBold" w:hAnsi="Nunito SemiBold" w:cs="Nunito SemiBold"/>
-          <w:sz w:val="16"/>
-          <w:szCs w:val="16"/>
-        </w:rPr>
-        <w:t xml:space="preserve">: Turborepo, </w:t>
+          <w:sz w:val="18"/>
+          <w:szCs w:val="18"/>
+        </w:rPr>
+        <w:t xml:space="preserve">: </w:t>
+      </w:r>
+      <w:r>
+        <w:rPr>
+          <w:rFonts w:ascii="Nunito SemiBold" w:eastAsia="Nunito SemiBold" w:hAnsi="Nunito SemiBold" w:cs="Nunito SemiBold"/>
+          <w:sz w:val="16"/>
+          <w:szCs w:val="16"/>
+        </w:rPr>
+        <w:t>React Native (Expo), TypeScript, Redux Toolkit, Firebase, RevenueCat, REST API</w:t>
+      </w:r>
+    </w:p>
+    <w:p>
+      <w:pPr>
+        <w:spacing w:line="240" w:lineRule="auto"/>
+        <w:ind w:left="-270"/>
+        <w:jc w:val="both"/>
+      </w:pPr>
+      <w:r>
+        <w:rPr>
+          <w:rFonts w:ascii="Nunito" w:eastAsia="Nunito" w:hAnsi="Nunito" w:cs="Nunito"/>
+          <w:b/>
+          <w:bCs/>
+          <w:sz w:val="16"/>
+          <w:szCs w:val="16"/>
+        </w:rPr>
+        <w:t xml:space="preserve"> </w:t>
       </w:r>
       <w:r>
         <w:rPr>
@@ -934,71 +1201,504 @@
           <w:sz w:val="16"/>
           <w:szCs w:val="16"/>
         </w:rPr>
-        <w:t>Next.js (Full Stack), Shadcn-UI, Drizzle ORM, PostgreSQL, better-auth</w:t>
-      </w:r>
-      <w:r>
-        <w:rPr>
-          <w:rFonts w:ascii="Nunito" w:eastAsia="Nunito" w:hAnsi="Nunito" w:cs="Nunito"/>
-          <w:b/>
-          <w:bCs/>
-          <w:sz w:val="16"/>
-          <w:szCs w:val="16"/>
-        </w:rPr>
-        <w:tab/>
-      </w:r>
-      <w:r>
-        <w:rPr>
-          <w:rFonts w:ascii="Nunito" w:eastAsia="Nunito" w:hAnsi="Nunito" w:cs="Nunito"/>
-          <w:b/>
-          <w:bCs/>
-          <w:sz w:val="16"/>
-          <w:szCs w:val="16"/>
-        </w:rPr>
-        <w:tab/>
-        <w:t xml:space="preserve"> </w:t>
-      </w:r>
-      <w:r>
-        <w:rPr>
-          <w:rFonts w:ascii="Nunito" w:eastAsia="Nunito" w:hAnsi="Nunito" w:cs="Nunito"/>
-          <w:b/>
-          <w:bCs/>
-          <w:sz w:val="16"/>
-          <w:szCs w:val="16"/>
-        </w:rPr>
-        <w:tab/>
-        <w:t xml:space="preserve">    </w:t>
-      </w:r>
-      <w:r>
-        <w:rPr>
-          <w:rFonts w:ascii="Nunito" w:eastAsia="Nunito" w:hAnsi="Nunito" w:cs="Nunito"/>
-          <w:i/>
-          <w:iCs/>
-          <w:sz w:val="16"/>
-          <w:szCs w:val="16"/>
-        </w:rPr>
         <w:t xml:space="preserve">     </w:t>
       </w:r>
-      <w:r>
-        <w:rPr>
-          <w:rFonts w:ascii="Nunito" w:eastAsia="Nunito" w:hAnsi="Nunito" w:cs="Nunito"/>
-          <w:i/>
-          <w:iCs/>
-          <w:sz w:val="16"/>
-          <w:szCs w:val="16"/>
-        </w:rPr>
-        <w:tab/>
-        <w:t xml:space="preserve">           </w:t>
-      </w:r>
-      <w:hyperlink r:id="rId8">
+      <w:hyperlink r:id="rId8" w:history="1">
         <w:r>
           <w:rPr>
+            <w:rStyle w:val="Hyperlink"/>
             <w:rFonts w:ascii="Nunito" w:eastAsia="Nunito" w:hAnsi="Nunito" w:cs="Nunito"/>
             <w:b/>
             <w:bCs/>
-            <w:color w:val="1155CC"/>
             <w:sz w:val="18"/>
             <w:szCs w:val="18"/>
-            <w:u w:val="single"/>
+          </w:rPr>
+          <w:t>Play Store</w:t>
+        </w:r>
+      </w:hyperlink>
+      <w:r>
+        <w:rPr>
+          <w:rFonts w:ascii="Nunito" w:eastAsia="Nunito" w:hAnsi="Nunito" w:cs="Nunito"/>
+          <w:b/>
+          <w:bCs/>
+          <w:sz w:val="18"/>
+          <w:szCs w:val="18"/>
+        </w:rPr>
+        <w:t xml:space="preserve">                     </w:t>
+      </w:r>
+      <w:hyperlink r:id="rId9" w:history="1">
+        <w:r>
+          <w:rPr>
+            <w:rStyle w:val="Hyperlink"/>
+            <w:rFonts w:ascii="Nunito" w:eastAsia="Nunito" w:hAnsi="Nunito" w:cs="Nunito"/>
+            <w:b/>
+            <w:bCs/>
+            <w:sz w:val="18"/>
+            <w:szCs w:val="18"/>
+          </w:rPr>
+          <w:t>App Store</w:t>
+        </w:r>
+      </w:hyperlink>
+      <w:r>
+        <w:rPr>
+          <w:rFonts w:ascii="Nunito" w:eastAsia="Nunito" w:hAnsi="Nunito" w:cs="Nunito"/>
+          <w:b/>
+          <w:bCs/>
+          <w:sz w:val="18"/>
+          <w:szCs w:val="18"/>
+        </w:rPr>
+        <w:t xml:space="preserve">                         </w:t>
+      </w:r>
+      <w:hyperlink r:id="rId10" w:history="1">
+        <w:r>
+          <w:rPr>
+            <w:rStyle w:val="Hyperlink"/>
+            <w:rFonts w:ascii="Nunito" w:eastAsia="Nunito" w:hAnsi="Nunito" w:cs="Nunito"/>
+            <w:b/>
+            <w:bCs/>
+            <w:sz w:val="18"/>
+            <w:szCs w:val="18"/>
+          </w:rPr>
+          <w:t>Source Code</w:t>
+        </w:r>
+      </w:hyperlink>
+    </w:p>
+    <w:p>
+      <w:pPr>
+        <w:spacing w:line="240" w:lineRule="auto"/>
+        <w:ind w:left="-270"/>
+        <w:jc w:val="both"/>
+        <w:rPr>
+          <w:rFonts w:ascii="Nunito" w:eastAsia="Nunito" w:hAnsi="Nunito" w:cs="Nunito"/>
+          <w:b/>
+          <w:bCs/>
+          <w:sz w:val="4"/>
+          <w:szCs w:val="4"/>
+        </w:rPr>
+      </w:pPr>
+    </w:p>
+    <w:p>
+      <w:pPr>
+        <w:spacing w:line="240" w:lineRule="auto"/>
+        <w:ind w:left="-270"/>
+        <w:jc w:val="both"/>
+        <w:rPr>
+          <w:rFonts w:ascii="Nunito" w:eastAsia="Nunito" w:hAnsi="Nunito" w:cs="Nunito"/>
+          <w:b/>
+          <w:bCs/>
+          <w:sz w:val="10"/>
+          <w:szCs w:val="10"/>
+        </w:rPr>
+      </w:pPr>
+    </w:p>
+    <w:p>
+      <w:pPr>
+        <w:spacing w:line="240" w:lineRule="auto"/>
+        <w:ind w:left="-270"/>
+        <w:jc w:val="both"/>
+        <w:rPr>
+          <w:rFonts w:ascii="Montserrat" w:eastAsia="Nunito" w:hAnsi="Montserrat" w:cs="Nunito"/>
+          <w:b/>
+          <w:bCs/>
+          <w:sz w:val="8"/>
+          <w:szCs w:val="8"/>
+        </w:rPr>
+      </w:pPr>
+      <w:r>
+        <w:rPr>
+          <w:rFonts w:ascii="Montserrat" w:eastAsia="Nunito" w:hAnsi="Montserrat" w:cs="Nunito"/>
+          <w:b/>
+          <w:bCs/>
+          <w:sz w:val="20"/>
+          <w:szCs w:val="20"/>
+        </w:rPr>
+        <w:t>Ezmart</w:t>
+      </w:r>
+      <w:r>
+        <w:rPr>
+          <w:rFonts w:ascii="Montserrat" w:eastAsia="Nunito" w:hAnsi="Montserrat" w:cs="Nunito"/>
+          <w:b/>
+          <w:bCs/>
+          <w:sz w:val="20"/>
+          <w:szCs w:val="20"/>
+        </w:rPr>
+        <w:t xml:space="preserve"> (</w:t>
+      </w:r>
+      <w:r>
+        <w:rPr>
+          <w:rFonts w:ascii="Montserrat" w:eastAsia="Nunito" w:hAnsi="Montserrat" w:cs="Nunito"/>
+          <w:b/>
+          <w:bCs/>
+          <w:sz w:val="20"/>
+          <w:szCs w:val="20"/>
+        </w:rPr>
+        <w:t>E-commerce full-stack website</w:t>
+      </w:r>
+      <w:r>
+        <w:rPr>
+          <w:rFonts w:ascii="Montserrat" w:eastAsia="Nunito" w:hAnsi="Montserrat" w:cs="Nunito"/>
+          <w:b/>
+          <w:bCs/>
+          <w:sz w:val="20"/>
+          <w:szCs w:val="20"/>
+        </w:rPr>
+        <w:t>)</w:t>
+      </w:r>
+    </w:p>
+    <w:p>
+      <w:pPr>
+        <w:spacing w:line="240" w:lineRule="auto"/>
+        <w:ind w:left="-270"/>
+        <w:jc w:val="both"/>
+        <w:rPr>
+          <w:rFonts w:ascii="Nunito" w:eastAsia="Nunito" w:hAnsi="Nunito" w:cs="Nunito"/>
+          <w:b/>
+          <w:bCs/>
+          <w:sz w:val="8"/>
+          <w:szCs w:val="8"/>
+        </w:rPr>
+      </w:pPr>
+      <w:r>
+        <w:rPr>
+          <w:rFonts w:ascii="Nunito" w:eastAsia="Nunito" w:hAnsi="Nunito" w:cs="Nunito"/>
+          <w:b/>
+          <w:bCs/>
+          <w:sz w:val="20"/>
+          <w:szCs w:val="20"/>
+        </w:rPr>
+        <w:tab/>
+      </w:r>
+      <w:r>
+        <w:rPr>
+          <w:rFonts w:ascii="Nunito" w:eastAsia="Nunito" w:hAnsi="Nunito" w:cs="Nunito"/>
+          <w:b/>
+          <w:bCs/>
+          <w:sz w:val="16"/>
+          <w:szCs w:val="16"/>
+        </w:rPr>
+        <w:tab/>
+        <w:t xml:space="preserve"> </w:t>
+      </w:r>
+      <w:r>
+        <w:rPr>
+          <w:rFonts w:ascii="Nunito" w:eastAsia="Nunito" w:hAnsi="Nunito" w:cs="Nunito"/>
+          <w:b/>
+          <w:bCs/>
+          <w:sz w:val="16"/>
+          <w:szCs w:val="16"/>
+        </w:rPr>
+        <w:tab/>
+        <w:t xml:space="preserve">    </w:t>
+      </w:r>
+      <w:r>
+        <w:rPr>
+          <w:rFonts w:ascii="Nunito" w:eastAsia="Nunito" w:hAnsi="Nunito" w:cs="Nunito"/>
+          <w:i/>
+          <w:iCs/>
+          <w:sz w:val="16"/>
+          <w:szCs w:val="16"/>
+        </w:rPr>
+        <w:t xml:space="preserve">     </w:t>
+      </w:r>
+    </w:p>
+    <w:p>
+      <w:pPr>
+        <w:numPr>
+          <w:ilvl w:val="0"/>
+          <w:numId w:val="1"/>
+        </w:numPr>
+        <w:spacing w:line="240" w:lineRule="auto"/>
+        <w:ind w:left="-90" w:hanging="180"/>
+        <w:jc w:val="both"/>
+        <w:rPr>
+          <w:rFonts w:ascii="Nunito" w:eastAsia="Nunito" w:hAnsi="Nunito" w:cs="Nunito"/>
+          <w:sz w:val="16"/>
+          <w:szCs w:val="16"/>
+          <w:lang w:val="en-US"/>
+        </w:rPr>
+      </w:pPr>
+      <w:r>
+        <w:rPr>
+          <w:rFonts w:ascii="Nunito" w:eastAsia="Nunito" w:hAnsi="Nunito" w:cs="Nunito"/>
+          <w:sz w:val="16"/>
+          <w:szCs w:val="16"/>
+          <w:lang w:val="en-US"/>
+        </w:rPr>
+        <w:t xml:space="preserve">Developed a full-stack e-commerce platform using Next.js, Express.js, MongoDB, and Mongoose. </w:t>
+      </w:r>
+    </w:p>
+    <w:p>
+      <w:pPr>
+        <w:numPr>
+          <w:ilvl w:val="0"/>
+          <w:numId w:val="1"/>
+        </w:numPr>
+        <w:spacing w:line="240" w:lineRule="auto"/>
+        <w:ind w:left="-90" w:hanging="180"/>
+        <w:jc w:val="both"/>
+        <w:rPr>
+          <w:rFonts w:ascii="Nunito" w:eastAsia="Nunito" w:hAnsi="Nunito" w:cs="Nunito"/>
+          <w:sz w:val="16"/>
+          <w:szCs w:val="16"/>
+          <w:lang w:val="en-US"/>
+        </w:rPr>
+      </w:pPr>
+      <w:r>
+        <w:rPr>
+          <w:rFonts w:ascii="Nunito" w:eastAsia="Nunito" w:hAnsi="Nunito" w:cs="Nunito"/>
+          <w:sz w:val="16"/>
+          <w:szCs w:val="16"/>
+          <w:lang w:val="en-US"/>
+        </w:rPr>
+        <w:t xml:space="preserve">Built RESTful APIs for authentication, product management, order processing, and admin operations. </w:t>
+      </w:r>
+    </w:p>
+    <w:p>
+      <w:pPr>
+        <w:numPr>
+          <w:ilvl w:val="0"/>
+          <w:numId w:val="1"/>
+        </w:numPr>
+        <w:spacing w:line="240" w:lineRule="auto"/>
+        <w:ind w:left="-90" w:hanging="180"/>
+        <w:jc w:val="both"/>
+        <w:rPr>
+          <w:rFonts w:ascii="Nunito" w:eastAsia="Nunito" w:hAnsi="Nunito" w:cs="Nunito"/>
+          <w:sz w:val="16"/>
+          <w:szCs w:val="16"/>
+          <w:lang w:val="en-US"/>
+        </w:rPr>
+      </w:pPr>
+      <w:r>
+        <w:rPr>
+          <w:rFonts w:ascii="Nunito" w:eastAsia="Nunito" w:hAnsi="Nunito" w:cs="Nunito"/>
+          <w:sz w:val="16"/>
+          <w:szCs w:val="16"/>
+          <w:lang w:val="en-US"/>
+        </w:rPr>
+        <w:t xml:space="preserve">Implemented Redux Toolkit for scalable state management across products, cart, </w:t>
+      </w:r>
+      <w:r>
+        <w:rPr>
+          <w:rFonts w:ascii="Nunito" w:eastAsia="Nunito" w:hAnsi="Nunito" w:cs="Nunito"/>
+          <w:sz w:val="16"/>
+          <w:szCs w:val="16"/>
+          <w:lang w:val="en-US"/>
+        </w:rPr>
+        <w:t>Wishlist</w:t>
+      </w:r>
+      <w:r>
+        <w:rPr>
+          <w:rFonts w:ascii="Nunito" w:eastAsia="Nunito" w:hAnsi="Nunito" w:cs="Nunito"/>
+          <w:sz w:val="16"/>
+          <w:szCs w:val="16"/>
+          <w:lang w:val="en-US"/>
+        </w:rPr>
+        <w:t xml:space="preserve">, and user authentication. </w:t>
+      </w:r>
+    </w:p>
+    <w:p>
+      <w:pPr>
+        <w:numPr>
+          <w:ilvl w:val="0"/>
+          <w:numId w:val="1"/>
+        </w:numPr>
+        <w:spacing w:line="240" w:lineRule="auto"/>
+        <w:ind w:left="-90" w:hanging="180"/>
+        <w:jc w:val="both"/>
+        <w:rPr>
+          <w:rFonts w:ascii="Nunito" w:eastAsia="Nunito" w:hAnsi="Nunito" w:cs="Nunito"/>
+          <w:sz w:val="16"/>
+          <w:szCs w:val="16"/>
+        </w:rPr>
+      </w:pPr>
+      <w:r>
+        <w:rPr>
+          <w:rFonts w:ascii="Nunito" w:eastAsia="Nunito" w:hAnsi="Nunito" w:cs="Nunito"/>
+          <w:sz w:val="16"/>
+          <w:szCs w:val="16"/>
+          <w:lang w:val="en-US"/>
+        </w:rPr>
+        <w:t>Designed MongoDB schemas and managed database operations using Mongoose.</w:t>
+      </w:r>
+      <w:r>
+        <w:rPr>
+          <w:rFonts w:ascii="Nunito" w:eastAsia="Nunito" w:hAnsi="Nunito" w:cs="Nunito"/>
+          <w:sz w:val="16"/>
+          <w:szCs w:val="16"/>
+        </w:rPr>
+        <w:t xml:space="preserve"> </w:t>
+      </w:r>
+    </w:p>
+    <w:p>
+      <w:pPr>
+        <w:numPr>
+          <w:ilvl w:val="0"/>
+          <w:numId w:val="1"/>
+        </w:numPr>
+        <w:spacing w:line="240" w:lineRule="auto"/>
+        <w:ind w:left="-90" w:hanging="180"/>
+        <w:jc w:val="both"/>
+        <w:rPr>
+          <w:rFonts w:ascii="Nunito" w:eastAsia="Nunito" w:hAnsi="Nunito" w:cs="Nunito"/>
+          <w:sz w:val="16"/>
+          <w:szCs w:val="16"/>
+        </w:rPr>
+      </w:pPr>
+      <w:r>
+        <w:rPr>
+          <w:rFonts w:ascii="Nunito" w:eastAsia="Nunito" w:hAnsi="Nunito" w:cs="Nunito"/>
+          <w:sz w:val="16"/>
+          <w:szCs w:val="16"/>
+        </w:rPr>
+        <w:t>Optimized SEO and application performance using Next.js server-side rendering and modern frontend practices.</w:t>
+      </w:r>
+    </w:p>
+    <w:p>
+      <w:pPr>
+        <w:spacing w:line="240" w:lineRule="auto"/>
+        <w:ind w:left="-90"/>
+        <w:jc w:val="both"/>
+        <w:rPr>
+          <w:rFonts w:ascii="Nunito" w:eastAsia="Nunito" w:hAnsi="Nunito" w:cs="Nunito"/>
+          <w:sz w:val="10"/>
+          <w:szCs w:val="10"/>
+        </w:rPr>
+      </w:pPr>
+    </w:p>
+    <w:p>
+      <w:pPr>
+        <w:spacing w:line="240" w:lineRule="auto"/>
+        <w:ind w:left="-270"/>
+        <w:jc w:val="both"/>
+        <w:rPr>
+          <w:rFonts w:ascii="Nunito" w:eastAsia="Nunito" w:hAnsi="Nunito" w:cs="Nunito"/>
+          <w:b/>
+          <w:bCs/>
+          <w:sz w:val="6"/>
+          <w:szCs w:val="6"/>
+        </w:rPr>
+      </w:pPr>
+    </w:p>
+    <w:p>
+      <w:pPr>
+        <w:spacing w:line="240" w:lineRule="auto"/>
+        <w:ind w:left="-270"/>
+        <w:jc w:val="both"/>
+        <w:rPr>
+          <w:rFonts w:ascii="Nunito" w:eastAsia="Nunito" w:hAnsi="Nunito" w:cs="Nunito"/>
+          <w:i/>
+          <w:iCs/>
+          <w:sz w:val="18"/>
+          <w:szCs w:val="18"/>
+        </w:rPr>
+      </w:pPr>
+      <w:r>
+        <w:rPr>
+          <w:rFonts w:ascii="Nunito" w:eastAsia="Nunito" w:hAnsi="Nunito" w:cs="Nunito"/>
+          <w:b/>
+          <w:bCs/>
+          <w:sz w:val="18"/>
+          <w:szCs w:val="18"/>
+        </w:rPr>
+        <w:t>Technology</w:t>
+      </w:r>
+      <w:r>
+        <w:rPr>
+          <w:rFonts w:ascii="Nunito" w:eastAsia="Nunito" w:hAnsi="Nunito" w:cs="Nunito"/>
+          <w:sz w:val="18"/>
+          <w:szCs w:val="18"/>
+        </w:rPr>
+        <w:t xml:space="preserve">: </w:t>
+      </w:r>
+      <w:r>
+        <w:rPr>
+          <w:rFonts w:ascii="Nunito" w:eastAsia="Nunito" w:hAnsi="Nunito" w:cs="Nunito"/>
+          <w:i/>
+          <w:iCs/>
+          <w:sz w:val="18"/>
+          <w:szCs w:val="18"/>
+        </w:rPr>
+        <w:t xml:space="preserve">Next.js, Shadcn-UI, </w:t>
+      </w:r>
+      <w:r>
+        <w:rPr>
+          <w:rFonts w:ascii="Nunito" w:eastAsia="Nunito" w:hAnsi="Nunito" w:cs="Nunito"/>
+          <w:i/>
+          <w:iCs/>
+          <w:sz w:val="18"/>
+          <w:szCs w:val="18"/>
+        </w:rPr>
+        <w:t>Express</w:t>
+      </w:r>
+      <w:r>
+        <w:rPr>
+          <w:rFonts w:ascii="Nunito" w:eastAsia="Nunito" w:hAnsi="Nunito" w:cs="Nunito"/>
+          <w:i/>
+          <w:iCs/>
+          <w:sz w:val="18"/>
+          <w:szCs w:val="18"/>
+        </w:rPr>
+        <w:t xml:space="preserve">, </w:t>
+      </w:r>
+      <w:r>
+        <w:rPr>
+          <w:rFonts w:ascii="Nunito" w:eastAsia="Nunito" w:hAnsi="Nunito" w:cs="Nunito"/>
+          <w:i/>
+          <w:iCs/>
+          <w:sz w:val="18"/>
+          <w:szCs w:val="18"/>
+        </w:rPr>
+        <w:t>MongoDB</w:t>
+      </w:r>
+      <w:r>
+        <w:rPr>
+          <w:rFonts w:ascii="Nunito" w:eastAsia="Nunito" w:hAnsi="Nunito" w:cs="Nunito"/>
+          <w:i/>
+          <w:iCs/>
+          <w:sz w:val="18"/>
+          <w:szCs w:val="18"/>
+        </w:rPr>
+        <w:t xml:space="preserve">, </w:t>
+      </w:r>
+      <w:r>
+        <w:rPr>
+          <w:rFonts w:ascii="Nunito" w:eastAsia="Nunito" w:hAnsi="Nunito" w:cs="Nunito"/>
+          <w:i/>
+          <w:iCs/>
+          <w:sz w:val="18"/>
+          <w:szCs w:val="18"/>
+        </w:rPr>
+        <w:t>Mongoose</w:t>
+      </w:r>
+    </w:p>
+    <w:p>
+      <w:pPr>
+        <w:spacing w:line="240" w:lineRule="auto"/>
+        <w:jc w:val="both"/>
+        <w:rPr>
+          <w:rFonts w:ascii="Nunito" w:eastAsia="Nunito" w:hAnsi="Nunito" w:cs="Nunito"/>
+          <w:i/>
+          <w:iCs/>
+          <w:sz w:val="2"/>
+          <w:szCs w:val="2"/>
+        </w:rPr>
+      </w:pPr>
+    </w:p>
+    <w:p>
+      <w:pPr>
+        <w:spacing w:line="240" w:lineRule="auto"/>
+        <w:jc w:val="both"/>
+      </w:pPr>
+      <w:hyperlink r:id="rId11" w:history="1">
+        <w:r>
+          <w:rPr>
+            <w:rStyle w:val="Hyperlink"/>
+            <w:rFonts w:ascii="Nunito" w:eastAsia="Nunito" w:hAnsi="Nunito" w:cs="Nunito"/>
+            <w:b/>
+            <w:bCs/>
+            <w:sz w:val="18"/>
+            <w:szCs w:val="18"/>
           </w:rPr>
           <w:t>Live Link</w:t>
         </w:r>
@@ -1011,466 +1711,77 @@
           <w:sz w:val="18"/>
           <w:szCs w:val="18"/>
         </w:rPr>
-        <w:t xml:space="preserve"> , </w:t>
-      </w:r>
-      <w:hyperlink r:id="rId9">
+        <w:t xml:space="preserve">                     </w:t>
+      </w:r>
+      <w:hyperlink r:id="rId12" w:history="1">
         <w:r>
           <w:rPr>
+            <w:rStyle w:val="Hyperlink"/>
             <w:rFonts w:ascii="Nunito" w:eastAsia="Nunito" w:hAnsi="Nunito" w:cs="Nunito"/>
             <w:b/>
             <w:bCs/>
-            <w:color w:val="1155CC"/>
             <w:sz w:val="18"/>
             <w:szCs w:val="18"/>
-            <w:u w:val="single"/>
           </w:rPr>
-          <w:t>Source Code</w:t>
+          <w:t>Client Code</w:t>
         </w:r>
       </w:hyperlink>
       <w:r>
         <w:rPr>
           <w:rFonts w:ascii="Nunito" w:eastAsia="Nunito" w:hAnsi="Nunito" w:cs="Nunito"/>
-          <w:sz w:val="18"/>
-          <w:szCs w:val="18"/>
-        </w:rPr>
-        <w:t xml:space="preserve"> </w:t>
-      </w:r>
-    </w:p>
-    <w:p>
-      <w:pPr>
-        <w:numPr>
-          <w:ilvl w:val="0"/>
-          <w:numId w:val="1"/>
-        </w:numPr>
-        <w:spacing w:line="240" w:lineRule="auto"/>
-        <w:ind w:left="-90" w:hanging="180"/>
-        <w:jc w:val="both"/>
-        <w:rPr>
-          <w:rFonts w:ascii="Nunito" w:eastAsia="Nunito" w:hAnsi="Nunito" w:cs="Nunito"/>
-          <w:sz w:val="18"/>
-          <w:szCs w:val="18"/>
-        </w:rPr>
-      </w:pPr>
-      <w:r>
-        <w:rPr>
-          <w:rFonts w:ascii="Nunito" w:eastAsia="Nunito" w:hAnsi="Nunito" w:cs="Nunito"/>
-          <w:sz w:val="18"/>
-          <w:szCs w:val="18"/>
-        </w:rPr>
-        <w:t>Implemented core features, including user authentication with Drizzle ORM and Better-Auth</w:t>
-      </w:r>
-    </w:p>
-    <w:p>
-      <w:pPr>
-        <w:numPr>
-          <w:ilvl w:val="0"/>
-          <w:numId w:val="1"/>
-        </w:numPr>
-        <w:spacing w:line="240" w:lineRule="auto"/>
-        <w:ind w:left="-90" w:hanging="180"/>
-        <w:jc w:val="both"/>
-        <w:rPr>
-          <w:rFonts w:ascii="Nunito" w:eastAsia="Nunito" w:hAnsi="Nunito" w:cs="Nunito"/>
-          <w:sz w:val="18"/>
-          <w:szCs w:val="18"/>
-        </w:rPr>
-      </w:pPr>
-      <w:r>
-        <w:rPr>
-          <w:rFonts w:ascii="Nunito" w:eastAsia="Nunito" w:hAnsi="Nunito" w:cs="Nunito"/>
-          <w:sz w:val="18"/>
-          <w:szCs w:val="18"/>
-        </w:rPr>
-        <w:t>Built a dynamic company search, filters, and detailed company pages.</w:t>
-      </w:r>
-    </w:p>
-    <w:p>
-      <w:pPr>
-        <w:numPr>
-          <w:ilvl w:val="0"/>
-          <w:numId w:val="1"/>
-        </w:numPr>
-        <w:spacing w:line="240" w:lineRule="auto"/>
-        <w:ind w:left="-90" w:hanging="180"/>
-        <w:jc w:val="both"/>
-        <w:rPr>
-          <w:rFonts w:ascii="Nunito" w:eastAsia="Nunito" w:hAnsi="Nunito" w:cs="Nunito"/>
-          <w:sz w:val="18"/>
-          <w:szCs w:val="18"/>
-        </w:rPr>
-      </w:pPr>
-      <w:r>
-        <w:rPr>
-          <w:rFonts w:ascii="Nunito" w:eastAsia="Nunito" w:hAnsi="Nunito" w:cs="Nunito"/>
-          <w:sz w:val="18"/>
-          <w:szCs w:val="18"/>
-        </w:rPr>
-        <w:t xml:space="preserve">Integrated Google Gemini AI API to create AI-based features like a cover page generator, and so on. </w:t>
-      </w:r>
-    </w:p>
-    <w:p>
-      <w:pPr>
-        <w:numPr>
-          <w:ilvl w:val="0"/>
-          <w:numId w:val="1"/>
-        </w:numPr>
-        <w:spacing w:line="240" w:lineRule="auto"/>
-        <w:ind w:left="-90" w:hanging="180"/>
-        <w:jc w:val="both"/>
-        <w:rPr>
-          <w:rFonts w:ascii="Nunito" w:eastAsia="Nunito" w:hAnsi="Nunito" w:cs="Nunito"/>
-          <w:sz w:val="18"/>
-          <w:szCs w:val="18"/>
-        </w:rPr>
-      </w:pPr>
-      <w:r>
-        <w:rPr>
-          <w:rFonts w:ascii="Nunito" w:eastAsia="Nunito" w:hAnsi="Nunito" w:cs="Nunito"/>
-          <w:sz w:val="18"/>
-          <w:szCs w:val="18"/>
-        </w:rPr>
-        <w:t xml:space="preserve">Creating a Transforming API to convert PDF to text, image to text, etc. </w:t>
-      </w:r>
-    </w:p>
-    <w:p>
-      <w:pPr>
-        <w:numPr>
-          <w:ilvl w:val="0"/>
-          <w:numId w:val="1"/>
-        </w:numPr>
-        <w:spacing w:line="240" w:lineRule="auto"/>
-        <w:ind w:left="-90" w:hanging="180"/>
-        <w:jc w:val="both"/>
-        <w:rPr>
-          <w:rFonts w:ascii="Nunito" w:eastAsia="Nunito" w:hAnsi="Nunito" w:cs="Nunito"/>
-          <w:sz w:val="18"/>
-          <w:szCs w:val="18"/>
-        </w:rPr>
-      </w:pPr>
-      <w:r>
-        <w:rPr>
-          <w:rFonts w:ascii="Nunito" w:eastAsia="Nunito" w:hAnsi="Nunito" w:cs="Nunito"/>
-          <w:sz w:val="18"/>
-          <w:szCs w:val="18"/>
-        </w:rPr>
-        <w:t xml:space="preserve">Following the neo-brutalism design trend and creating a retro design </w:t>
-      </w:r>
-    </w:p>
-    <w:p>
-      <w:pPr>
-        <w:numPr>
-          <w:ilvl w:val="0"/>
-          <w:numId w:val="1"/>
-        </w:numPr>
-        <w:spacing w:line="240" w:lineRule="auto"/>
-        <w:ind w:left="-90" w:hanging="180"/>
-        <w:jc w:val="both"/>
-        <w:rPr>
-          <w:rFonts w:ascii="Nunito" w:eastAsia="Nunito" w:hAnsi="Nunito" w:cs="Nunito"/>
-          <w:sz w:val="18"/>
-          <w:szCs w:val="18"/>
-        </w:rPr>
-      </w:pPr>
-      <w:r>
-        <w:rPr>
-          <w:rFonts w:ascii="Nunito" w:eastAsia="Nunito" w:hAnsi="Nunito" w:cs="Nunito"/>
-          <w:sz w:val="18"/>
-          <w:szCs w:val="18"/>
-        </w:rPr>
-        <w:t>Maintained a clean, modular TypeScript codebase; containerized the application with Docker for future hosting with CI/CD.</w:t>
-      </w:r>
-      <w:r>
-        <w:rPr>
-          <w:rFonts w:ascii="Nunito" w:eastAsia="Nunito" w:hAnsi="Nunito" w:cs="Nunito"/>
-          <w:sz w:val="20"/>
-          <w:szCs w:val="20"/>
-        </w:rPr>
-        <w:t xml:space="preserve"> </w:t>
-      </w:r>
-    </w:p>
-    <w:p>
-      <w:pPr>
-        <w:numPr>
-          <w:ilvl w:val="0"/>
-          <w:numId w:val="1"/>
-        </w:numPr>
-        <w:spacing w:line="240" w:lineRule="auto"/>
-        <w:ind w:left="-90" w:hanging="180"/>
-        <w:jc w:val="both"/>
-        <w:rPr>
-          <w:rFonts w:ascii="Nunito" w:eastAsia="Nunito" w:hAnsi="Nunito" w:cs="Nunito"/>
-          <w:sz w:val="18"/>
-          <w:szCs w:val="18"/>
-        </w:rPr>
-      </w:pPr>
-      <w:r>
-        <w:rPr>
-          <w:rFonts w:ascii="Nunito" w:eastAsia="Nunito" w:hAnsi="Nunito" w:cs="Nunito"/>
-          <w:sz w:val="18"/>
-          <w:szCs w:val="18"/>
-        </w:rPr>
-        <w:t>Focused on clean code structure, modular components, and scalable architecture.</w:t>
-      </w:r>
-    </w:p>
-    <w:p>
-      <w:pPr>
-        <w:spacing w:line="240" w:lineRule="auto"/>
-        <w:ind w:left="720"/>
-        <w:jc w:val="both"/>
-        <w:rPr>
-          <w:rFonts w:ascii="Nunito" w:eastAsia="Nunito" w:hAnsi="Nunito" w:cs="Nunito"/>
-          <w:sz w:val="18"/>
-          <w:szCs w:val="18"/>
-        </w:rPr>
-      </w:pPr>
-    </w:p>
-    <w:p>
-      <w:pPr>
-        <w:spacing w:line="240" w:lineRule="auto"/>
-        <w:ind w:left="-270"/>
-        <w:rPr>
-          <w:rFonts w:ascii="Montserrat" w:eastAsia="Montserrat" w:hAnsi="Montserrat" w:cs="Montserrat"/>
-          <w:b/>
-          <w:bCs/>
-          <w:sz w:val="18"/>
-          <w:szCs w:val="18"/>
-        </w:rPr>
-      </w:pPr>
-      <w:r>
-        <w:rPr>
-          <w:rFonts w:ascii="Montserrat" w:eastAsia="Montserrat" w:hAnsi="Montserrat" w:cs="Montserrat"/>
-          <w:b/>
-          <w:bCs/>
-          <w:sz w:val="20"/>
-          <w:szCs w:val="20"/>
-        </w:rPr>
-        <w:t>Promptsu</w:t>
-      </w:r>
-      <w:r>
-        <w:rPr>
-          <w:rFonts w:ascii="Montserrat" w:eastAsia="Montserrat" w:hAnsi="Montserrat" w:cs="Montserrat"/>
-          <w:b/>
-          <w:bCs/>
-          <w:sz w:val="18"/>
-          <w:szCs w:val="18"/>
-        </w:rPr>
-        <w:t xml:space="preserve"> </w:t>
-      </w:r>
-    </w:p>
-    <w:p>
-      <w:pPr>
-        <w:spacing w:line="240" w:lineRule="auto"/>
-        <w:ind w:left="-270"/>
-        <w:rPr>
-          <w:rFonts w:ascii="Nunito" w:eastAsia="Nunito" w:hAnsi="Nunito" w:cs="Nunito"/>
-          <w:sz w:val="18"/>
-          <w:szCs w:val="18"/>
-        </w:rPr>
-      </w:pPr>
-      <w:r>
-        <w:rPr>
-          <w:rFonts w:ascii="Nunito SemiBold" w:eastAsia="Nunito SemiBold" w:hAnsi="Nunito SemiBold" w:cs="Nunito SemiBold"/>
-          <w:sz w:val="18"/>
-          <w:szCs w:val="18"/>
-        </w:rPr>
-        <w:t>A browser extension that adds AI-powered prompt enhancement to the AI chatbot interface and a collection of prompts to copy and paste</w:t>
-      </w:r>
-      <w:r>
-        <w:rPr>
-          <w:rFonts w:ascii="Nunito SemiBold" w:eastAsia="Nunito SemiBold" w:hAnsi="Nunito SemiBold" w:cs="Nunito SemiBold"/>
-          <w:sz w:val="16"/>
-          <w:szCs w:val="16"/>
-        </w:rPr>
-        <w:br/>
-      </w:r>
-      <w:r>
-        <w:rPr>
-          <w:rFonts w:ascii="Nunito" w:eastAsia="Nunito" w:hAnsi="Nunito" w:cs="Nunito"/>
-          <w:b/>
-          <w:bCs/>
-          <w:sz w:val="16"/>
-          <w:szCs w:val="16"/>
-        </w:rPr>
-        <w:t>Technology</w:t>
-      </w:r>
-      <w:r>
-        <w:rPr>
-          <w:rFonts w:ascii="Nunito SemiBold" w:eastAsia="Nunito SemiBold" w:hAnsi="Nunito SemiBold" w:cs="Nunito SemiBold"/>
-          <w:sz w:val="16"/>
-          <w:szCs w:val="16"/>
-        </w:rPr>
-        <w:t xml:space="preserve">: </w:t>
-      </w:r>
-      <w:r>
-        <w:rPr>
-          <w:rFonts w:ascii="Nunito" w:eastAsia="Nunito" w:hAnsi="Nunito" w:cs="Nunito"/>
-          <w:i/>
-          <w:iCs/>
-          <w:sz w:val="16"/>
-          <w:szCs w:val="16"/>
-        </w:rPr>
-        <w:t xml:space="preserve"> Turorepo, NextJS (web), wxt.dev (Browser Extension, Node-Express)</w:t>
-      </w:r>
-      <w:r>
-        <w:rPr>
-          <w:rFonts w:ascii="Nunito" w:eastAsia="Nunito" w:hAnsi="Nunito" w:cs="Nunito"/>
-          <w:b/>
-          <w:bCs/>
-          <w:sz w:val="16"/>
-          <w:szCs w:val="16"/>
-        </w:rPr>
-        <w:t xml:space="preserve">     </w:t>
-      </w:r>
-      <w:r>
-        <w:rPr>
-          <w:rFonts w:ascii="Nunito" w:eastAsia="Nunito" w:hAnsi="Nunito" w:cs="Nunito"/>
-          <w:b/>
-          <w:bCs/>
-          <w:sz w:val="16"/>
-          <w:szCs w:val="16"/>
-        </w:rPr>
-        <w:tab/>
-      </w:r>
-      <w:r>
-        <w:rPr>
-          <w:rFonts w:ascii="Nunito" w:eastAsia="Nunito" w:hAnsi="Nunito" w:cs="Nunito"/>
-          <w:b/>
-          <w:bCs/>
-          <w:sz w:val="16"/>
-          <w:szCs w:val="16"/>
-        </w:rPr>
-        <w:tab/>
-      </w:r>
-      <w:r>
-        <w:rPr>
-          <w:rFonts w:ascii="Nunito" w:eastAsia="Nunito" w:hAnsi="Nunito" w:cs="Nunito"/>
-          <w:b/>
-          <w:bCs/>
-          <w:sz w:val="16"/>
-          <w:szCs w:val="16"/>
-        </w:rPr>
-        <w:tab/>
-      </w:r>
-      <w:hyperlink r:id="rId10">
+          <w:b/>
+          <w:bCs/>
+          <w:sz w:val="18"/>
+          <w:szCs w:val="18"/>
+        </w:rPr>
+        <w:t xml:space="preserve">                         </w:t>
+      </w:r>
+      <w:hyperlink r:id="rId13" w:history="1">
         <w:r>
           <w:rPr>
+            <w:rStyle w:val="Hyperlink"/>
             <w:rFonts w:ascii="Nunito" w:eastAsia="Nunito" w:hAnsi="Nunito" w:cs="Nunito"/>
             <w:b/>
             <w:bCs/>
-            <w:color w:val="1155CC"/>
             <w:sz w:val="18"/>
             <w:szCs w:val="18"/>
-            <w:u w:val="single"/>
           </w:rPr>
-          <w:t>GitHub Release</w:t>
+          <w:t>S</w:t>
         </w:r>
-      </w:hyperlink>
-      <w:r>
-        <w:rPr>
-          <w:rFonts w:ascii="Nunito" w:eastAsia="Nunito" w:hAnsi="Nunito" w:cs="Nunito"/>
-          <w:b/>
-          <w:bCs/>
-          <w:sz w:val="16"/>
-          <w:szCs w:val="16"/>
-        </w:rPr>
-        <w:t xml:space="preserve">, </w:t>
-      </w:r>
-      <w:r>
-        <w:rPr>
-          <w:rFonts w:ascii="Nunito" w:eastAsia="Nunito" w:hAnsi="Nunito" w:cs="Nunito"/>
-          <w:b/>
-          <w:bCs/>
-          <w:sz w:val="16"/>
-          <w:szCs w:val="16"/>
-        </w:rPr>
-        <w:tab/>
-      </w:r>
-      <w:hyperlink r:id="rId11">
         <w:r>
           <w:rPr>
+            <w:rStyle w:val="Hyperlink"/>
             <w:rFonts w:ascii="Nunito" w:eastAsia="Nunito" w:hAnsi="Nunito" w:cs="Nunito"/>
             <w:b/>
             <w:bCs/>
-            <w:color w:val="1155CC"/>
             <w:sz w:val="18"/>
             <w:szCs w:val="18"/>
-            <w:u w:val="single"/>
           </w:rPr>
-          <w:t>Source Code</w:t>
+          <w:t>erver cod</w:t>
+        </w:r>
+        <w:r>
+          <w:rPr>
+            <w:rStyle w:val="Hyperlink"/>
+            <w:rFonts w:ascii="Nunito" w:eastAsia="Nunito" w:hAnsi="Nunito" w:cs="Nunito"/>
+            <w:b/>
+            <w:bCs/>
+            <w:sz w:val="18"/>
+            <w:szCs w:val="18"/>
+          </w:rPr>
+          <w:t>e</w:t>
         </w:r>
       </w:hyperlink>
     </w:p>
     <w:p>
       <w:pPr>
-        <w:numPr>
-          <w:ilvl w:val="0"/>
-          <w:numId w:val="1"/>
-        </w:numPr>
-        <w:spacing w:line="240" w:lineRule="auto"/>
-        <w:ind w:left="-90" w:hanging="180"/>
+        <w:spacing w:line="240" w:lineRule="auto"/>
         <w:jc w:val="both"/>
         <w:rPr>
           <w:rFonts w:ascii="Nunito" w:eastAsia="Nunito" w:hAnsi="Nunito" w:cs="Nunito"/>
-          <w:sz w:val="18"/>
-          <w:szCs w:val="18"/>
-        </w:rPr>
-      </w:pPr>
-      <w:r>
-        <w:rPr>
-          <w:rFonts w:ascii="Nunito" w:eastAsia="Nunito" w:hAnsi="Nunito" w:cs="Nunito"/>
-          <w:sz w:val="18"/>
-          <w:szCs w:val="18"/>
-        </w:rPr>
-        <w:t xml:space="preserve">Maintained strict linting config and fixed all with biomejs and other standard packages. </w:t>
-      </w:r>
-    </w:p>
-    <w:p>
-      <w:pPr>
-        <w:numPr>
-          <w:ilvl w:val="0"/>
-          <w:numId w:val="1"/>
-        </w:numPr>
-        <w:spacing w:line="240" w:lineRule="auto"/>
-        <w:ind w:left="-90" w:hanging="180"/>
-        <w:jc w:val="both"/>
-        <w:rPr>
-          <w:rFonts w:ascii="Nunito" w:eastAsia="Nunito" w:hAnsi="Nunito" w:cs="Nunito"/>
-          <w:sz w:val="18"/>
-          <w:szCs w:val="18"/>
-        </w:rPr>
-      </w:pPr>
-      <w:r>
-        <w:rPr>
-          <w:rFonts w:ascii="Nunito" w:eastAsia="Nunito" w:hAnsi="Nunito" w:cs="Nunito"/>
-          <w:sz w:val="18"/>
-          <w:szCs w:val="18"/>
-        </w:rPr>
-        <w:t xml:space="preserve">Managing Turborepo to ensure a clean, maintainable, and scalable codebase for each app or package. </w:t>
-      </w:r>
-    </w:p>
-    <w:p>
-      <w:pPr>
-        <w:numPr>
-          <w:ilvl w:val="0"/>
-          <w:numId w:val="1"/>
-        </w:numPr>
-        <w:spacing w:line="240" w:lineRule="auto"/>
-        <w:ind w:left="-90" w:hanging="180"/>
-        <w:jc w:val="both"/>
-        <w:rPr>
-          <w:rFonts w:ascii="Nunito" w:eastAsia="Nunito" w:hAnsi="Nunito" w:cs="Nunito"/>
-          <w:sz w:val="18"/>
-          <w:szCs w:val="18"/>
-        </w:rPr>
-      </w:pPr>
-      <w:r>
-        <w:rPr>
-          <w:rFonts w:ascii="Nunito" w:eastAsia="Nunito" w:hAnsi="Nunito" w:cs="Nunito"/>
-          <w:sz w:val="18"/>
-          <w:szCs w:val="18"/>
-        </w:rPr>
-        <w:t xml:space="preserve">Publishing packages with CI/CD in GitHub release for both Chrome and Firefox. </w:t>
-      </w:r>
+          <w:sz w:val="2"/>
+          <w:szCs w:val="2"/>
+        </w:rPr>
+      </w:pPr>
     </w:p>
     <w:p>
       <w:pPr>
@@ -1479,8 +1790,8 @@
         <w:jc w:val="both"/>
         <w:rPr>
           <w:rFonts w:ascii="Nunito" w:eastAsia="Nunito" w:hAnsi="Nunito" w:cs="Nunito"/>
-          <w:sz w:val="18"/>
-          <w:szCs w:val="18"/>
+          <w:sz w:val="14"/>
+          <w:szCs w:val="14"/>
         </w:rPr>
       </w:pPr>
     </w:p>
@@ -1513,42 +1824,13 @@
         <w:spacing w:line="240" w:lineRule="auto"/>
         <w:ind w:left="-270"/>
         <w:rPr>
-          <w:rFonts w:ascii="Nunito" w:eastAsia="Nunito" w:hAnsi="Nunito" w:cs="Nunito"/>
-          <w:b/>
-          <w:bCs/>
-        </w:rPr>
-      </w:pPr>
-      <w:r>
-        <w:rPr>
           <w:rFonts w:ascii="Montserrat" w:eastAsia="Montserrat" w:hAnsi="Montserrat" w:cs="Montserrat"/>
           <w:b/>
           <w:bCs/>
-          <w:sz w:val="18"/>
-          <w:szCs w:val="18"/>
-        </w:rPr>
-        <w:t>International University of Scholars</w:t>
-      </w:r>
-      <w:r>
-        <w:rPr>
-          <w:rFonts w:ascii="Montserrat" w:eastAsia="Montserrat" w:hAnsi="Montserrat" w:cs="Montserrat"/>
-          <w:b/>
-          <w:bCs/>
-          <w:sz w:val="18"/>
-          <w:szCs w:val="18"/>
-        </w:rPr>
-        <w:tab/>
-        <w:t xml:space="preserve">                                                                                                                     </w:t>
-      </w:r>
-      <w:r>
-        <w:rPr>
-          <w:rFonts w:ascii="Nunito" w:eastAsia="Nunito" w:hAnsi="Nunito" w:cs="Nunito"/>
-          <w:b/>
-          <w:bCs/>
-          <w:sz w:val="16"/>
-          <w:szCs w:val="16"/>
-        </w:rPr>
-        <w:t>Dhaka, Bangladesh</w:t>
-      </w:r>
+          <w:sz w:val="6"/>
+          <w:szCs w:val="6"/>
+        </w:rPr>
+      </w:pPr>
     </w:p>
     <w:p>
       <w:pPr>
@@ -1556,43 +1838,55 @@
         <w:ind w:left="-270"/>
         <w:rPr>
           <w:rFonts w:ascii="Nunito" w:eastAsia="Nunito" w:hAnsi="Nunito" w:cs="Nunito"/>
+          <w:b/>
+          <w:bCs/>
           <w:i/>
           <w:iCs/>
-          <w:sz w:val="16"/>
-          <w:szCs w:val="16"/>
-        </w:rPr>
-      </w:pPr>
-      <w:r>
-        <w:rPr>
-          <w:rFonts w:ascii="Nunito" w:eastAsia="Nunito" w:hAnsi="Nunito" w:cs="Nunito"/>
+          <w:sz w:val="20"/>
+          <w:szCs w:val="20"/>
+        </w:rPr>
+      </w:pPr>
+      <w:r>
+        <w:rPr>
+          <w:rFonts w:ascii="Nunito" w:eastAsia="Nunito" w:hAnsi="Nunito" w:cs="Nunito"/>
+          <w:b/>
+          <w:bCs/>
           <w:i/>
           <w:iCs/>
-          <w:sz w:val="18"/>
-          <w:szCs w:val="18"/>
-        </w:rPr>
-        <w:t>C.S.C</w:t>
-      </w:r>
-      <w:r>
-        <w:rPr>
-          <w:rFonts w:ascii="Nunito" w:eastAsia="Nunito" w:hAnsi="Nunito" w:cs="Nunito"/>
+          <w:sz w:val="20"/>
+          <w:szCs w:val="20"/>
+        </w:rPr>
+        <w:t>Bachelor of Science (</w:t>
+      </w:r>
+      <w:r>
+        <w:rPr>
+          <w:rFonts w:ascii="Nunito" w:eastAsia="Nunito" w:hAnsi="Nunito" w:cs="Nunito"/>
+          <w:b/>
+          <w:bCs/>
           <w:i/>
           <w:iCs/>
-          <w:sz w:val="18"/>
-          <w:szCs w:val="18"/>
-        </w:rPr>
-        <w:t xml:space="preserve"> (Honors)</w:t>
-      </w:r>
-      <w:r>
-        <w:rPr>
-          <w:rFonts w:ascii="Nunito" w:eastAsia="Nunito" w:hAnsi="Nunito" w:cs="Nunito"/>
+          <w:sz w:val="20"/>
+          <w:szCs w:val="20"/>
+        </w:rPr>
+        <w:t>B.Sc.</w:t>
+      </w:r>
+      <w:r>
+        <w:rPr>
+          <w:rFonts w:ascii="Nunito" w:eastAsia="Nunito" w:hAnsi="Nunito" w:cs="Nunito"/>
+          <w:b/>
+          <w:bCs/>
           <w:i/>
           <w:iCs/>
-          <w:sz w:val="18"/>
-          <w:szCs w:val="18"/>
-        </w:rPr>
-        <w:tab/>
-      </w:r>
-      <w:r>
+          <w:sz w:val="20"/>
+          <w:szCs w:val="20"/>
+        </w:rPr>
+        <w:t>) in CSE</w:t>
+      </w:r>
+    </w:p>
+    <w:p>
+      <w:pPr>
+        <w:spacing w:line="240" w:lineRule="auto"/>
+        <w:ind w:left="-270"/>
         <w:rPr>
           <w:rFonts w:ascii="Nunito" w:eastAsia="Nunito" w:hAnsi="Nunito" w:cs="Nunito"/>
           <w:i/>
@@ -1600,8 +1894,7 @@
           <w:sz w:val="18"/>
           <w:szCs w:val="18"/>
         </w:rPr>
-        <w:tab/>
-      </w:r>
+      </w:pPr>
       <w:r>
         <w:rPr>
           <w:rFonts w:ascii="Nunito" w:eastAsia="Nunito" w:hAnsi="Nunito" w:cs="Nunito"/>
@@ -1610,42 +1903,38 @@
           <w:sz w:val="18"/>
           <w:szCs w:val="18"/>
         </w:rPr>
-        <w:tab/>
-      </w:r>
-      <w:r>
-        <w:rPr>
-          <w:rFonts w:ascii="Nunito" w:eastAsia="Nunito" w:hAnsi="Nunito" w:cs="Nunito"/>
+        <w:t>2023 - Present</w:t>
+      </w:r>
+    </w:p>
+    <w:p>
+      <w:pPr>
+        <w:spacing w:line="240" w:lineRule="auto"/>
+        <w:ind w:left="-270"/>
+        <w:rPr>
+          <w:rFonts w:ascii="Nunito" w:eastAsia="Nunito" w:hAnsi="Nunito" w:cs="Nunito"/>
+          <w:b/>
+          <w:bCs/>
           <w:i/>
           <w:iCs/>
           <w:sz w:val="18"/>
           <w:szCs w:val="18"/>
         </w:rPr>
-        <w:tab/>
-      </w:r>
-      <w:r>
-        <w:rPr>
-          <w:rFonts w:ascii="Nunito" w:eastAsia="Nunito" w:hAnsi="Nunito" w:cs="Nunito"/>
+      </w:pPr>
+      <w:r>
+        <w:rPr>
+          <w:rFonts w:ascii="Nunito" w:eastAsia="Nunito" w:hAnsi="Nunito" w:cs="Nunito"/>
+          <w:b/>
+          <w:bCs/>
           <w:i/>
           <w:iCs/>
           <w:sz w:val="18"/>
           <w:szCs w:val="18"/>
         </w:rPr>
-        <w:tab/>
-        <w:t xml:space="preserve">                                                                                                           </w:t>
-      </w:r>
-      <w:r>
-        <w:rPr>
-          <w:rFonts w:ascii="Nunito" w:eastAsia="Nunito" w:hAnsi="Nunito" w:cs="Nunito"/>
-          <w:i/>
-          <w:iCs/>
-          <w:sz w:val="16"/>
-          <w:szCs w:val="16"/>
-        </w:rPr>
-        <w:t>October 2024 – Present</w:t>
+        <w:t>University of Scholars, Bonanni, Dhaka.</w:t>
       </w:r>
     </w:p>
     <w:sectPr>
-      <w:headerReference w:type="default" r:id="rId12"/>
+      <w:headerReference w:type="default" r:id="rId14"/>
       <w:pgSz w:w="12240" w:h="15840"/>
       <w:pgMar w:top="270" w:right="450" w:bottom="90" w:left="720" w:header="720" w:footer="720" w:gutter="0"/>
       <w:pgNumType w:start="1"/>
@@ -2244,7 +2533,7 @@
       <w:lvlText w:val="-"/>
       <w:lvlJc w:val="left"/>
       <w:pPr>
-        <w:ind w:left="720" w:hanging="900"/>
+        <w:ind w:left="1080" w:hanging="900"/>
       </w:pPr>
       <w:rPr>
         <w:u w:val="none"/>
@@ -2256,7 +2545,7 @@
       <w:lvlText w:val="-"/>
       <w:lvlJc w:val="left"/>
       <w:pPr>
-        <w:ind w:left="1440" w:hanging="360"/>
+        <w:ind w:left="1800" w:hanging="360"/>
       </w:pPr>
       <w:rPr>
         <w:u w:val="none"/>
@@ -2268,7 +2557,7 @@
       <w:lvlText w:val="-"/>
       <w:lvlJc w:val="left"/>
       <w:pPr>
-        <w:ind w:left="2160" w:hanging="360"/>
+        <w:ind w:left="2520" w:hanging="360"/>
       </w:pPr>
       <w:rPr>
         <w:u w:val="none"/>
@@ -2280,7 +2569,7 @@
       <w:lvlText w:val="-"/>
       <w:lvlJc w:val="left"/>
       <w:pPr>
-        <w:ind w:left="2880" w:hanging="360"/>
+        <w:ind w:left="3240" w:hanging="360"/>
       </w:pPr>
       <w:rPr>
         <w:u w:val="none"/>
@@ -2292,7 +2581,7 @@
       <w:lvlText w:val="-"/>
       <w:lvlJc w:val="left"/>
       <w:pPr>
-        <w:ind w:left="3600" w:hanging="360"/>
+        <w:ind w:left="3960" w:hanging="360"/>
       </w:pPr>
       <w:rPr>
         <w:u w:val="none"/>
@@ -2304,7 +2593,7 @@
       <w:lvlText w:val="-"/>
       <w:lvlJc w:val="left"/>
       <w:pPr>
-        <w:ind w:left="4320" w:hanging="360"/>
+        <w:ind w:left="4680" w:hanging="360"/>
       </w:pPr>
       <w:rPr>
         <w:u w:val="none"/>
@@ -2316,7 +2605,7 @@
       <w:lvlText w:val="-"/>
       <w:lvlJc w:val="left"/>
       <w:pPr>
-        <w:ind w:left="5040" w:hanging="360"/>
+        <w:ind w:left="5400" w:hanging="360"/>
       </w:pPr>
       <w:rPr>
         <w:u w:val="none"/>
@@ -2328,7 +2617,7 @@
       <w:lvlText w:val="-"/>
       <w:lvlJc w:val="left"/>
       <w:pPr>
-        <w:ind w:left="5760" w:hanging="360"/>
+        <w:ind w:left="6120" w:hanging="360"/>
       </w:pPr>
       <w:rPr>
         <w:u w:val="none"/>
@@ -2340,7 +2629,7 @@
       <w:lvlText w:val="-"/>
       <w:lvlJc w:val="left"/>
       <w:pPr>
-        <w:ind w:left="6480" w:hanging="360"/>
+        <w:ind w:left="6840" w:hanging="360"/>
       </w:pPr>
       <w:rPr>
         <w:u w:val="none"/>
@@ -2352,6 +2641,9 @@
   </w:num>
   <w:num w:numId="2" w16cid:durableId="271864505">
     <w:abstractNumId w:val="0"/>
+  </w:num>
+  <w:num w:numId="3" w16cid:durableId="1697194570">
+    <w:abstractNumId w:val="1"/>
   </w:num>
 </w:numbering>
 </file>
@@ -2754,6 +3046,7 @@
   <w:style w:type="paragraph" w:default="1" w:styleId="Normal">
     <w:name w:val="Normal"/>
     <w:qFormat/>
+    <w:rsid w:val="001F6B6A"/>
   </w:style>
   <w:style w:type="paragraph" w:styleId="Heading1">
     <w:name w:val="heading 1"/>
@@ -3072,6 +3365,41 @@
     <w:link w:val="Footer"/>
     <w:uiPriority w:val="99"/>
     <w:rsid w:val="003032B6"/>
+  </w:style>
+  <w:style w:type="character" w:styleId="Hyperlink">
+    <w:name w:val="Hyperlink"/>
+    <w:basedOn w:val="DefaultParagraphFont"/>
+    <w:uiPriority w:val="99"/>
+    <w:unhideWhenUsed/>
+    <w:rsid w:val="00AC49EB"/>
+    <w:rPr>
+      <w:color w:val="0000FF" w:themeColor="hyperlink"/>
+      <w:u w:val="single"/>
+    </w:rPr>
+  </w:style>
+  <w:style w:type="character" w:styleId="UnresolvedMention">
+    <w:name w:val="Unresolved Mention"/>
+    <w:basedOn w:val="DefaultParagraphFont"/>
+    <w:uiPriority w:val="99"/>
+    <w:semiHidden/>
+    <w:unhideWhenUsed/>
+    <w:rsid w:val="00AC49EB"/>
+    <w:rPr>
+      <w:color w:val="605E5C"/>
+      <w:shd w:val="clear" w:color="auto" w:fill="E1DFDD"/>
+    </w:rPr>
+  </w:style>
+  <w:style w:type="character" w:styleId="FollowedHyperlink">
+    <w:name w:val="FollowedHyperlink"/>
+    <w:basedOn w:val="DefaultParagraphFont"/>
+    <w:uiPriority w:val="99"/>
+    <w:semiHidden/>
+    <w:unhideWhenUsed/>
+    <w:rsid w:val="00AC49EB"/>
+    <w:rPr>
+      <w:color w:val="800080" w:themeColor="followedHyperlink"/>
+      <w:u w:val="single"/>
+    </w:rPr>
   </w:style>
 </w:styles>
 </file>

</xml_diff>

<commit_message>
feat: implement ScrollArea component with Lenis integration and update resume documents
</commit_message>
<xml_diff>
--- a/Mohammed Arif Resume.docx
+++ b/Mohammed Arif Resume.docx
@@ -189,6 +189,7 @@
         </w:rPr>
         <w:t xml:space="preserve">, </w:t>
       </w:r>
+      <w:proofErr w:type="spellStart"/>
       <w:r>
         <w:rPr>
           <w:rFonts w:ascii="Nunito" w:eastAsia="Nunito" w:hAnsi="Nunito" w:cs="Nunito"/>
@@ -196,8 +197,29 @@
           <w:sz w:val="18"/>
           <w:szCs w:val="18"/>
         </w:rPr>
-        <w:t>Shadcn/UI, NativeWind</w:t>
-      </w:r>
+        <w:t>Shadcn</w:t>
+      </w:r>
+      <w:proofErr w:type="spellEnd"/>
+      <w:r>
+        <w:rPr>
+          <w:rFonts w:ascii="Nunito" w:eastAsia="Nunito" w:hAnsi="Nunito" w:cs="Nunito"/>
+          <w:color w:val="0F0F0F"/>
+          <w:sz w:val="18"/>
+          <w:szCs w:val="18"/>
+        </w:rPr>
+        <w:t xml:space="preserve">/UI, </w:t>
+      </w:r>
+      <w:proofErr w:type="spellStart"/>
+      <w:r>
+        <w:rPr>
+          <w:rFonts w:ascii="Nunito" w:eastAsia="Nunito" w:hAnsi="Nunito" w:cs="Nunito"/>
+          <w:color w:val="0F0F0F"/>
+          <w:sz w:val="18"/>
+          <w:szCs w:val="18"/>
+        </w:rPr>
+        <w:t>NativeWind</w:t>
+      </w:r>
+      <w:proofErr w:type="spellEnd"/>
       <w:r>
         <w:rPr>
           <w:rFonts w:ascii="Nunito" w:eastAsia="Nunito" w:hAnsi="Nunito" w:cs="Nunito"/>
@@ -262,8 +284,19 @@
           <w:sz w:val="18"/>
           <w:szCs w:val="18"/>
         </w:rPr>
-        <w:t>React Native (Expo), Firebase, RevenueCat</w:t>
-      </w:r>
+        <w:t xml:space="preserve">React Native (Expo), Firebase, </w:t>
+      </w:r>
+      <w:proofErr w:type="spellStart"/>
+      <w:r>
+        <w:rPr>
+          <w:rFonts w:ascii="Nunito" w:eastAsia="Nunito" w:hAnsi="Nunito" w:cs="Nunito"/>
+          <w:color w:val="0F0F0F"/>
+          <w:sz w:val="18"/>
+          <w:szCs w:val="18"/>
+        </w:rPr>
+        <w:t>RevenueCat</w:t>
+      </w:r>
+      <w:proofErr w:type="spellEnd"/>
     </w:p>
     <w:p>
       <w:pPr>
@@ -732,7 +765,25 @@
           <w:sz w:val="16"/>
           <w:szCs w:val="16"/>
         </w:rPr>
-        <w:t>Integrated third-party services and SDKs including Firebase, RevenueCat, authentication systems, analytics, and payment-related services.</w:t>
+        <w:t xml:space="preserve">Integrated third-party services and SDKs including Firebase, </w:t>
+      </w:r>
+      <w:proofErr w:type="spellStart"/>
+      <w:r>
+        <w:rPr>
+          <w:rFonts w:ascii="Nunito" w:eastAsia="Nunito" w:hAnsi="Nunito" w:cs="Nunito"/>
+          <w:sz w:val="16"/>
+          <w:szCs w:val="16"/>
+        </w:rPr>
+        <w:t>RevenueCat</w:t>
+      </w:r>
+      <w:proofErr w:type="spellEnd"/>
+      <w:r>
+        <w:rPr>
+          <w:rFonts w:ascii="Nunito" w:eastAsia="Nunito" w:hAnsi="Nunito" w:cs="Nunito"/>
+          <w:sz w:val="16"/>
+          <w:szCs w:val="16"/>
+        </w:rPr>
+        <w:t>, authentication systems, analytics, and payment-related services.</w:t>
       </w:r>
     </w:p>
     <w:p>
@@ -1174,7 +1225,25 @@
           <w:sz w:val="16"/>
           <w:szCs w:val="16"/>
         </w:rPr>
-        <w:t>React Native (Expo), TypeScript, Redux Toolkit, Firebase, RevenueCat, REST API</w:t>
+        <w:t xml:space="preserve">React Native (Expo), TypeScript, Redux Toolkit, Firebase, </w:t>
+      </w:r>
+      <w:proofErr w:type="spellStart"/>
+      <w:r>
+        <w:rPr>
+          <w:rFonts w:ascii="Nunito SemiBold" w:eastAsia="Nunito SemiBold" w:hAnsi="Nunito SemiBold" w:cs="Nunito SemiBold"/>
+          <w:sz w:val="16"/>
+          <w:szCs w:val="16"/>
+        </w:rPr>
+        <w:t>RevenueCat</w:t>
+      </w:r>
+      <w:proofErr w:type="spellEnd"/>
+      <w:r>
+        <w:rPr>
+          <w:rFonts w:ascii="Nunito SemiBold" w:eastAsia="Nunito SemiBold" w:hAnsi="Nunito SemiBold" w:cs="Nunito SemiBold"/>
+          <w:sz w:val="16"/>
+          <w:szCs w:val="16"/>
+        </w:rPr>
+        <w:t>, REST API</w:t>
       </w:r>
     </w:p>
     <w:p>
@@ -1304,6 +1373,7 @@
           <w:szCs w:val="8"/>
         </w:rPr>
       </w:pPr>
+      <w:proofErr w:type="spellStart"/>
       <w:r>
         <w:rPr>
           <w:rFonts w:ascii="Montserrat" w:eastAsia="Nunito" w:hAnsi="Montserrat" w:cs="Nunito"/>
@@ -1314,6 +1384,7 @@
         </w:rPr>
         <w:t>Ezmart</w:t>
       </w:r>
+      <w:proofErr w:type="spellEnd"/>
       <w:r>
         <w:rPr>
           <w:rFonts w:ascii="Montserrat" w:eastAsia="Nunito" w:hAnsi="Montserrat" w:cs="Nunito"/>
@@ -1619,7 +1690,29 @@
           <w:sz w:val="18"/>
           <w:szCs w:val="18"/>
         </w:rPr>
-        <w:t xml:space="preserve">Next.js, Shadcn-UI, </w:t>
+        <w:t xml:space="preserve">Next.js, </w:t>
+      </w:r>
+      <w:proofErr w:type="spellStart"/>
+      <w:r>
+        <w:rPr>
+          <w:rFonts w:ascii="Nunito" w:eastAsia="Nunito" w:hAnsi="Nunito" w:cs="Nunito"/>
+          <w:i/>
+          <w:iCs/>
+          <w:sz w:val="18"/>
+          <w:szCs w:val="18"/>
+        </w:rPr>
+        <w:t>Shadcn</w:t>
+      </w:r>
+      <w:proofErr w:type="spellEnd"/>
+      <w:r>
+        <w:rPr>
+          <w:rFonts w:ascii="Nunito" w:eastAsia="Nunito" w:hAnsi="Nunito" w:cs="Nunito"/>
+          <w:i/>
+          <w:iCs/>
+          <w:sz w:val="18"/>
+          <w:szCs w:val="18"/>
+        </w:rPr>
+        <w:t xml:space="preserve">-UI, </w:t>
       </w:r>
       <w:r>
         <w:rPr>
@@ -2089,8 +2182,36 @@
           <w:sz w:val="20"/>
           <w:szCs w:val="20"/>
         </w:rPr>
-        <w:t>work-mohammed-arif</w:t>
-      </w:r>
+        <w:t>work-</w:t>
+      </w:r>
+      <w:proofErr w:type="spellStart"/>
+      <w:r>
+        <w:rPr>
+          <w:rFonts w:ascii="Spectral" w:eastAsia="Spectral" w:hAnsi="Spectral" w:cs="Spectral"/>
+          <w:sz w:val="20"/>
+          <w:szCs w:val="20"/>
+        </w:rPr>
+        <w:t>mohammed</w:t>
+      </w:r>
+      <w:proofErr w:type="spellEnd"/>
+      <w:r>
+        <w:rPr>
+          <w:rFonts w:ascii="Spectral" w:eastAsia="Spectral" w:hAnsi="Spectral" w:cs="Spectral"/>
+          <w:sz w:val="20"/>
+          <w:szCs w:val="20"/>
+        </w:rPr>
+        <w:t>-</w:t>
+      </w:r>
+      <w:proofErr w:type="spellStart"/>
+      <w:r>
+        <w:rPr>
+          <w:rFonts w:ascii="Spectral" w:eastAsia="Spectral" w:hAnsi="Spectral" w:cs="Spectral"/>
+          <w:sz w:val="20"/>
+          <w:szCs w:val="20"/>
+        </w:rPr>
+        <w:t>arif</w:t>
+      </w:r>
+      <w:proofErr w:type="spellEnd"/>
     </w:hyperlink>
     <w:r>
       <w:rPr>
@@ -2152,6 +2273,7 @@
       <w:t xml:space="preserve"> </w:t>
     </w:r>
     <w:hyperlink r:id="rId4">
+      <w:proofErr w:type="spellStart"/>
       <w:r>
         <w:rPr>
           <w:rFonts w:ascii="Spectral" w:eastAsia="Spectral" w:hAnsi="Spectral" w:cs="Spectral"/>
@@ -2160,6 +2282,7 @@
         </w:rPr>
         <w:t>HProgrammerArif</w:t>
       </w:r>
+      <w:proofErr w:type="spellEnd"/>
     </w:hyperlink>
     <w:r>
       <w:rPr>
@@ -3164,6 +3287,7 @@
   <w:style w:type="character" w:default="1" w:styleId="DefaultParagraphFont">
     <w:name w:val="Default Paragraph Font"/>
     <w:uiPriority w:val="1"/>
+    <w:semiHidden/>
     <w:unhideWhenUsed/>
   </w:style>
   <w:style w:type="table" w:default="1" w:styleId="TableNormal">

</xml_diff>

<commit_message>
feat: add TicketLove project details and update resume documents
</commit_message>
<xml_diff>
--- a/Mohammed Arif Resume.docx
+++ b/Mohammed Arif Resume.docx
@@ -1,6 +1,6 @@
 
 <file path=word/document.xml><?xml version="1.0" encoding="utf-8"?>
-<w:document xmlns:wpc="http://schemas.microsoft.com/office/word/2010/wordprocessingCanvas" xmlns:cx="http://schemas.microsoft.com/office/drawing/2014/chartex" xmlns:cx1="http://schemas.microsoft.com/office/drawing/2015/9/8/chartex" xmlns:cx2="http://schemas.microsoft.com/office/drawing/2015/10/21/chartex" xmlns:cx3="http://schemas.microsoft.com/office/drawing/2016/5/9/chartex" xmlns:cx4="http://schemas.microsoft.com/office/drawing/2016/5/10/chartex" xmlns:cx5="http://schemas.microsoft.com/office/drawing/2016/5/11/chartex" xmlns:cx6="http://schemas.microsoft.com/office/drawing/2016/5/12/chartex" xmlns:cx7="http://schemas.microsoft.com/office/drawing/2016/5/13/chartex" xmlns:cx8="http://schemas.microsoft.com/office/drawing/2016/5/14/chartex" xmlns:mc="http://schemas.openxmlformats.org/markup-compatibility/2006" xmlns:aink="http://schemas.microsoft.com/office/drawing/2016/ink" xmlns:am3d="http://schemas.microsoft.com/office/drawing/2017/model3d" xmlns:o="urn:schemas-microsoft-com:office:office" xmlns:oel="http://schemas.microsoft.com/office/2019/extlst" xmlns:r="http://schemas.openxmlformats.org/officeDocument/2006/relationships" xmlns:m="http://schemas.openxmlformats.org/officeDocument/2006/math" xmlns:v="urn:schemas-microsoft-com:vml" xmlns:wp14="http://schemas.microsoft.com/office/word/2010/wordprocessingDrawing" xmlns:wp="http://schemas.openxmlformats.org/drawingml/2006/wordprocessingDrawing" xmlns:w10="urn:schemas-microsoft-com:office:word" xmlns:w="http://schemas.openxmlformats.org/wordprocessingml/2006/main" xmlns:w14="http://schemas.microsoft.com/office/word/2010/wordml" xmlns:w15="http://schemas.microsoft.com/office/word/2012/wordml" xmlns:w16cex="http://schemas.microsoft.com/office/word/2018/wordml/cex" xmlns:w16cid="http://schemas.microsoft.com/office/word/2016/wordml/cid" xmlns:w16="http://schemas.microsoft.com/office/word/2018/wordml" xmlns:w16du="http://schemas.microsoft.com/office/word/2023/wordml/word16du" xmlns:w16sdtdh="http://schemas.microsoft.com/office/word/2020/wordml/sdtdatahash" xmlns:w16sdtfl="http://schemas.microsoft.com/office/word/2024/wordml/sdtformatlock" xmlns:w16se="http://schemas.microsoft.com/office/word/2015/wordml/symex" xmlns:wpg="http://schemas.microsoft.com/office/word/2010/wordprocessingGroup" xmlns:wpi="http://schemas.microsoft.com/office/word/2010/wordprocessingInk" xmlns:wne="http://schemas.microsoft.com/office/word/2006/wordml" xmlns:wps="http://schemas.microsoft.com/office/word/2010/wordprocessingShape" mc:Ignorable="w14 w15 w16se w16cid w16 w16cex w16sdtdh w16sdtfl w16du wp14">
+<w:document xmlns:wpc="http://schemas.microsoft.com/office/word/2010/wordprocessingCanvas" xmlns:cx="http://schemas.microsoft.com/office/drawing/2014/chartex" xmlns:cx1="http://schemas.microsoft.com/office/drawing/2015/9/8/chartex" xmlns:cx2="http://schemas.microsoft.com/office/drawing/2015/10/21/chartex" xmlns:cx3="http://schemas.microsoft.com/office/drawing/2016/5/9/chartex" xmlns:cx4="http://schemas.microsoft.com/office/drawing/2016/5/10/chartex" xmlns:cx5="http://schemas.microsoft.com/office/drawing/2016/5/11/chartex" xmlns:cx6="http://schemas.microsoft.com/office/drawing/2016/5/12/chartex" xmlns:cx7="http://schemas.microsoft.com/office/drawing/2016/5/13/chartex" xmlns:cx8="http://schemas.microsoft.com/office/drawing/2016/5/14/chartex" xmlns:mc="http://schemas.openxmlformats.org/markup-compatibility/2006" xmlns:aink="http://schemas.microsoft.com/office/drawing/2016/ink" xmlns:am3d="http://schemas.microsoft.com/office/drawing/2017/model3d" xmlns:o="urn:schemas-microsoft-com:office:office" xmlns:oel="http://schemas.microsoft.com/office/2019/extlst" xmlns:r="http://schemas.openxmlformats.org/officeDocument/2006/relationships" xmlns:m="http://schemas.openxmlformats.org/officeDocument/2006/math" xmlns:v="urn:schemas-microsoft-com:vml" xmlns:wp14="http://schemas.microsoft.com/office/word/2010/wordprocessingDrawing" xmlns:wp="http://schemas.openxmlformats.org/drawingml/2006/wordprocessingDrawing" xmlns:w10="urn:schemas-microsoft-com:office:word" xmlns:w="http://schemas.openxmlformats.org/wordprocessingml/2006/main" xmlns:w14="http://schemas.microsoft.com/office/word/2010/wordml" xmlns:w15="http://schemas.microsoft.com/office/word/2012/wordml" xmlns:w16cei="http://schemas.microsoft.com/office/word/2026/wordml/cei" xmlns:w16cex="http://schemas.microsoft.com/office/word/2018/wordml/cex" xmlns:w16cid="http://schemas.microsoft.com/office/word/2016/wordml/cid" xmlns:w16="http://schemas.microsoft.com/office/word/2018/wordml" xmlns:w16du="http://schemas.microsoft.com/office/word/2023/wordml/word16du" xmlns:w16sdtdh="http://schemas.microsoft.com/office/word/2020/wordml/sdtdatahash" xmlns:w16sdtfl="http://schemas.microsoft.com/office/word/2024/wordml/sdtformatlock" xmlns:w16se="http://schemas.microsoft.com/office/word/2015/wordml/symex" xmlns:wpg="http://schemas.microsoft.com/office/word/2010/wordprocessingGroup" xmlns:wpi="http://schemas.microsoft.com/office/word/2010/wordprocessingInk" xmlns:wne="http://schemas.microsoft.com/office/word/2006/wordml" xmlns:wps="http://schemas.microsoft.com/office/word/2010/wordprocessingShape" mc:Ignorable="w14 w15 w16se w16cid w16 w16cex w16sdtdh w16sdtfl w16du wp14">
   <w:body>
     <w:p>
       <w:pPr>
@@ -74,7 +74,79 @@
           <w:szCs w:val="18"/>
           <w:lang w:val="en-US"/>
         </w:rPr>
-        <w:t>Full-Stack Developer with 1+ year of hands-on experience building scalable web and cross-platform mobile applications. Skilled in React, Next.js, and React Native (Expo), with focus on performance optimization and clean architecture.</w:t>
+        <w:t>Full-Stack Developer with 1</w:t>
+      </w:r>
+      <w:r>
+        <w:rPr>
+          <w:rFonts w:ascii="Nunito" w:eastAsia="Nunito" w:hAnsi="Nunito" w:cs="Nunito"/>
+          <w:color w:val="0F0F0F"/>
+          <w:sz w:val="18"/>
+          <w:szCs w:val="18"/>
+          <w:lang w:val="en-US"/>
+        </w:rPr>
+        <w:t>.5</w:t>
+      </w:r>
+      <w:r>
+        <w:rPr>
+          <w:rFonts w:ascii="Nunito" w:eastAsia="Nunito" w:hAnsi="Nunito" w:cs="Nunito"/>
+          <w:color w:val="0F0F0F"/>
+          <w:sz w:val="18"/>
+          <w:szCs w:val="18"/>
+          <w:lang w:val="en-US"/>
+        </w:rPr>
+        <w:t xml:space="preserve">+ </w:t>
+      </w:r>
+      <w:proofErr w:type="gramStart"/>
+      <w:r>
+        <w:rPr>
+          <w:rFonts w:ascii="Nunito" w:eastAsia="Nunito" w:hAnsi="Nunito" w:cs="Nunito"/>
+          <w:color w:val="0F0F0F"/>
+          <w:sz w:val="18"/>
+          <w:szCs w:val="18"/>
+          <w:lang w:val="en-US"/>
+        </w:rPr>
+        <w:t>year</w:t>
+      </w:r>
+      <w:proofErr w:type="gramEnd"/>
+      <w:r>
+        <w:rPr>
+          <w:rFonts w:ascii="Nunito" w:eastAsia="Nunito" w:hAnsi="Nunito" w:cs="Nunito"/>
+          <w:color w:val="0F0F0F"/>
+          <w:sz w:val="18"/>
+          <w:szCs w:val="18"/>
+          <w:lang w:val="en-US"/>
+        </w:rPr>
+        <w:t xml:space="preserve"> of hands-on experience building scalable web and cross-platform mobile applications. Skilled in React Native (Expo), </w:t>
+      </w:r>
+      <w:r>
+        <w:rPr>
+          <w:rFonts w:ascii="Nunito" w:eastAsia="Nunito" w:hAnsi="Nunito" w:cs="Nunito"/>
+          <w:color w:val="0F0F0F"/>
+          <w:sz w:val="18"/>
+          <w:szCs w:val="18"/>
+          <w:lang w:val="en-US"/>
+        </w:rPr>
+        <w:t>Next.js</w:t>
+      </w:r>
+      <w:r>
+        <w:rPr>
+          <w:rFonts w:ascii="Nunito" w:eastAsia="Nunito" w:hAnsi="Nunito" w:cs="Nunito"/>
+          <w:color w:val="0F0F0F"/>
+          <w:sz w:val="18"/>
+          <w:szCs w:val="18"/>
+          <w:lang w:val="en-US"/>
+        </w:rPr>
+        <w:t xml:space="preserve"> and Node.js </w:t>
+      </w:r>
+      <w:r>
+        <w:rPr>
+          <w:rFonts w:ascii="Nunito" w:eastAsia="Nunito" w:hAnsi="Nunito" w:cs="Nunito"/>
+          <w:color w:val="0F0F0F"/>
+          <w:sz w:val="18"/>
+          <w:szCs w:val="18"/>
+          <w:lang w:val="en-US"/>
+        </w:rPr>
+        <w:t>with focus on performance optimization and clean architecture.</w:t>
       </w:r>
     </w:p>
     <w:p>
@@ -197,27 +269,7 @@
           <w:sz w:val="18"/>
           <w:szCs w:val="18"/>
         </w:rPr>
-        <w:t>Shadcn</w:t>
-      </w:r>
-      <w:proofErr w:type="spellEnd"/>
-      <w:r>
-        <w:rPr>
-          <w:rFonts w:ascii="Nunito" w:eastAsia="Nunito" w:hAnsi="Nunito" w:cs="Nunito"/>
-          <w:color w:val="0F0F0F"/>
-          <w:sz w:val="18"/>
-          <w:szCs w:val="18"/>
-        </w:rPr>
-        <w:t xml:space="preserve">/UI, </w:t>
-      </w:r>
-      <w:proofErr w:type="spellStart"/>
-      <w:r>
-        <w:rPr>
-          <w:rFonts w:ascii="Nunito" w:eastAsia="Nunito" w:hAnsi="Nunito" w:cs="Nunito"/>
-          <w:color w:val="0F0F0F"/>
-          <w:sz w:val="18"/>
-          <w:szCs w:val="18"/>
-        </w:rPr>
-        <w:t>NativeWind</w:t>
+        <w:t>ShadcnUI</w:t>
       </w:r>
       <w:proofErr w:type="spellEnd"/>
       <w:r>
@@ -297,6 +349,26 @@
         <w:t>RevenueCat</w:t>
       </w:r>
       <w:proofErr w:type="spellEnd"/>
+      <w:r>
+        <w:rPr>
+          <w:rFonts w:ascii="Nunito" w:eastAsia="Nunito" w:hAnsi="Nunito" w:cs="Nunito"/>
+          <w:color w:val="0F0F0F"/>
+          <w:sz w:val="18"/>
+          <w:szCs w:val="18"/>
+        </w:rPr>
+        <w:t xml:space="preserve">, </w:t>
+      </w:r>
+      <w:proofErr w:type="spellStart"/>
+      <w:r>
+        <w:rPr>
+          <w:rFonts w:ascii="Nunito" w:eastAsia="Nunito" w:hAnsi="Nunito" w:cs="Nunito"/>
+          <w:color w:val="0F0F0F"/>
+          <w:sz w:val="18"/>
+          <w:szCs w:val="18"/>
+        </w:rPr>
+        <w:t>NativeWind</w:t>
+      </w:r>
+      <w:proofErr w:type="spellEnd"/>
     </w:p>
     <w:p>
       <w:pPr>
@@ -335,6 +407,15 @@
           <w:szCs w:val="18"/>
         </w:rPr>
         <w:t>Vite, Git, GitHub, Figma</w:t>
+      </w:r>
+      <w:r>
+        <w:rPr>
+          <w:rFonts w:ascii="Nunito" w:eastAsia="Nunito" w:hAnsi="Nunito" w:cs="Nunito"/>
+          <w:color w:val="0F0F0F"/>
+          <w:sz w:val="18"/>
+          <w:szCs w:val="18"/>
+        </w:rPr>
+        <w:t>, Docker</w:t>
       </w:r>
     </w:p>
     <w:p>
@@ -482,7 +563,17 @@
           <w:sz w:val="16"/>
           <w:szCs w:val="16"/>
         </w:rPr>
-        <w:t>June 2025 - present</w:t>
+        <w:t>May</w:t>
+      </w:r>
+      <w:r>
+        <w:rPr>
+          <w:rFonts w:ascii="Nunito" w:eastAsia="Nunito" w:hAnsi="Nunito" w:cs="Nunito"/>
+          <w:i/>
+          <w:iCs/>
+          <w:sz w:val="16"/>
+          <w:szCs w:val="16"/>
+        </w:rPr>
+        <w:t xml:space="preserve"> 2025 - present</w:t>
       </w:r>
     </w:p>
     <w:p>
@@ -590,7 +681,7 @@
           <w:sz w:val="16"/>
           <w:szCs w:val="16"/>
         </w:rPr>
-        <w:t>5</w:t>
+        <w:t>7</w:t>
       </w:r>
       <w:r>
         <w:rPr>
@@ -1096,30 +1187,6 @@
           <w:szCs w:val="16"/>
         </w:rPr>
         <w:t>Built scalable mobile UI components and handled complex state management using Redux Toolkit.</w:t>
-      </w:r>
-    </w:p>
-    <w:p>
-      <w:pPr>
-        <w:numPr>
-          <w:ilvl w:val="0"/>
-          <w:numId w:val="1"/>
-        </w:numPr>
-        <w:spacing w:line="240" w:lineRule="auto"/>
-        <w:ind w:left="-90" w:hanging="180"/>
-        <w:jc w:val="both"/>
-        <w:rPr>
-          <w:rFonts w:ascii="Nunito" w:eastAsia="Nunito" w:hAnsi="Nunito" w:cs="Nunito"/>
-          <w:sz w:val="16"/>
-          <w:szCs w:val="16"/>
-        </w:rPr>
-      </w:pPr>
-      <w:r>
-        <w:rPr>
-          <w:rFonts w:ascii="Nunito" w:eastAsia="Nunito" w:hAnsi="Nunito" w:cs="Nunito"/>
-          <w:sz w:val="16"/>
-          <w:szCs w:val="16"/>
-        </w:rPr>
-        <w:t xml:space="preserve">Following the neo-brutalism design trend and creating a retro design </w:t>
       </w:r>
     </w:p>
     <w:p>
@@ -1793,7 +1860,29 @@
             <w:sz w:val="18"/>
             <w:szCs w:val="18"/>
           </w:rPr>
-          <w:t>Live Link</w:t>
+          <w:t>Live L</w:t>
+        </w:r>
+        <w:r>
+          <w:rPr>
+            <w:rStyle w:val="Hyperlink"/>
+            <w:rFonts w:ascii="Nunito" w:eastAsia="Nunito" w:hAnsi="Nunito" w:cs="Nunito"/>
+            <w:b/>
+            <w:bCs/>
+            <w:sz w:val="18"/>
+            <w:szCs w:val="18"/>
+          </w:rPr>
+          <w:t>i</w:t>
+        </w:r>
+        <w:r>
+          <w:rPr>
+            <w:rStyle w:val="Hyperlink"/>
+            <w:rFonts w:ascii="Nunito" w:eastAsia="Nunito" w:hAnsi="Nunito" w:cs="Nunito"/>
+            <w:b/>
+            <w:bCs/>
+            <w:sz w:val="18"/>
+            <w:szCs w:val="18"/>
+          </w:rPr>
+          <w:t>nk</w:t>
         </w:r>
       </w:hyperlink>
       <w:r>
@@ -1816,7 +1905,29 @@
             <w:sz w:val="18"/>
             <w:szCs w:val="18"/>
           </w:rPr>
-          <w:t>Client Code</w:t>
+          <w:t xml:space="preserve">Client </w:t>
+        </w:r>
+        <w:r>
+          <w:rPr>
+            <w:rStyle w:val="Hyperlink"/>
+            <w:rFonts w:ascii="Nunito" w:eastAsia="Nunito" w:hAnsi="Nunito" w:cs="Nunito"/>
+            <w:b/>
+            <w:bCs/>
+            <w:sz w:val="18"/>
+            <w:szCs w:val="18"/>
+          </w:rPr>
+          <w:t>C</w:t>
+        </w:r>
+        <w:r>
+          <w:rPr>
+            <w:rStyle w:val="Hyperlink"/>
+            <w:rFonts w:ascii="Nunito" w:eastAsia="Nunito" w:hAnsi="Nunito" w:cs="Nunito"/>
+            <w:b/>
+            <w:bCs/>
+            <w:sz w:val="18"/>
+            <w:szCs w:val="18"/>
+          </w:rPr>
+          <w:t>ode</w:t>
         </w:r>
       </w:hyperlink>
       <w:r>
@@ -1850,7 +1961,29 @@
             <w:sz w:val="18"/>
             <w:szCs w:val="18"/>
           </w:rPr>
-          <w:t>erver cod</w:t>
+          <w:t xml:space="preserve">erver </w:t>
+        </w:r>
+        <w:r>
+          <w:rPr>
+            <w:rStyle w:val="Hyperlink"/>
+            <w:rFonts w:ascii="Nunito" w:eastAsia="Nunito" w:hAnsi="Nunito" w:cs="Nunito"/>
+            <w:b/>
+            <w:bCs/>
+            <w:sz w:val="18"/>
+            <w:szCs w:val="18"/>
+          </w:rPr>
+          <w:t>c</w:t>
+        </w:r>
+        <w:r>
+          <w:rPr>
+            <w:rStyle w:val="Hyperlink"/>
+            <w:rFonts w:ascii="Nunito" w:eastAsia="Nunito" w:hAnsi="Nunito" w:cs="Nunito"/>
+            <w:b/>
+            <w:bCs/>
+            <w:sz w:val="18"/>
+            <w:szCs w:val="18"/>
+          </w:rPr>
+          <w:t>od</w:t>
         </w:r>
         <w:r>
           <w:rPr>
@@ -2038,7 +2171,7 @@
 </file>
 
 <file path=word/endnotes.xml><?xml version="1.0" encoding="utf-8"?>
-<w:endnotes xmlns:wpc="http://schemas.microsoft.com/office/word/2010/wordprocessingCanvas" xmlns:cx="http://schemas.microsoft.com/office/drawing/2014/chartex" xmlns:cx1="http://schemas.microsoft.com/office/drawing/2015/9/8/chartex" xmlns:cx2="http://schemas.microsoft.com/office/drawing/2015/10/21/chartex" xmlns:cx3="http://schemas.microsoft.com/office/drawing/2016/5/9/chartex" xmlns:cx4="http://schemas.microsoft.com/office/drawing/2016/5/10/chartex" xmlns:cx5="http://schemas.microsoft.com/office/drawing/2016/5/11/chartex" xmlns:cx6="http://schemas.microsoft.com/office/drawing/2016/5/12/chartex" xmlns:cx7="http://schemas.microsoft.com/office/drawing/2016/5/13/chartex" xmlns:cx8="http://schemas.microsoft.com/office/drawing/2016/5/14/chartex" xmlns:mc="http://schemas.openxmlformats.org/markup-compatibility/2006" xmlns:aink="http://schemas.microsoft.com/office/drawing/2016/ink" xmlns:am3d="http://schemas.microsoft.com/office/drawing/2017/model3d" xmlns:o="urn:schemas-microsoft-com:office:office" xmlns:oel="http://schemas.microsoft.com/office/2019/extlst" xmlns:r="http://schemas.openxmlformats.org/officeDocument/2006/relationships" xmlns:m="http://schemas.openxmlformats.org/officeDocument/2006/math" xmlns:v="urn:schemas-microsoft-com:vml" xmlns:wp14="http://schemas.microsoft.com/office/word/2010/wordprocessingDrawing" xmlns:wp="http://schemas.openxmlformats.org/drawingml/2006/wordprocessingDrawing" xmlns:w10="urn:schemas-microsoft-com:office:word" xmlns:w="http://schemas.openxmlformats.org/wordprocessingml/2006/main" xmlns:w14="http://schemas.microsoft.com/office/word/2010/wordml" xmlns:w15="http://schemas.microsoft.com/office/word/2012/wordml" xmlns:w16cex="http://schemas.microsoft.com/office/word/2018/wordml/cex" xmlns:w16cid="http://schemas.microsoft.com/office/word/2016/wordml/cid" xmlns:w16="http://schemas.microsoft.com/office/word/2018/wordml" xmlns:w16du="http://schemas.microsoft.com/office/word/2023/wordml/word16du" xmlns:w16sdtdh="http://schemas.microsoft.com/office/word/2020/wordml/sdtdatahash" xmlns:w16sdtfl="http://schemas.microsoft.com/office/word/2024/wordml/sdtformatlock" xmlns:w16se="http://schemas.microsoft.com/office/word/2015/wordml/symex" xmlns:wpg="http://schemas.microsoft.com/office/word/2010/wordprocessingGroup" xmlns:wpi="http://schemas.microsoft.com/office/word/2010/wordprocessingInk" xmlns:wne="http://schemas.microsoft.com/office/word/2006/wordml" xmlns:wps="http://schemas.microsoft.com/office/word/2010/wordprocessingShape" mc:Ignorable="w14 w15 w16se w16cid w16 w16cex w16sdtdh w16sdtfl w16du wp14">
+<w:endnotes xmlns:wpc="http://schemas.microsoft.com/office/word/2010/wordprocessingCanvas" xmlns:cx="http://schemas.microsoft.com/office/drawing/2014/chartex" xmlns:cx1="http://schemas.microsoft.com/office/drawing/2015/9/8/chartex" xmlns:cx2="http://schemas.microsoft.com/office/drawing/2015/10/21/chartex" xmlns:cx3="http://schemas.microsoft.com/office/drawing/2016/5/9/chartex" xmlns:cx4="http://schemas.microsoft.com/office/drawing/2016/5/10/chartex" xmlns:cx5="http://schemas.microsoft.com/office/drawing/2016/5/11/chartex" xmlns:cx6="http://schemas.microsoft.com/office/drawing/2016/5/12/chartex" xmlns:cx7="http://schemas.microsoft.com/office/drawing/2016/5/13/chartex" xmlns:cx8="http://schemas.microsoft.com/office/drawing/2016/5/14/chartex" xmlns:mc="http://schemas.openxmlformats.org/markup-compatibility/2006" xmlns:aink="http://schemas.microsoft.com/office/drawing/2016/ink" xmlns:am3d="http://schemas.microsoft.com/office/drawing/2017/model3d" xmlns:o="urn:schemas-microsoft-com:office:office" xmlns:oel="http://schemas.microsoft.com/office/2019/extlst" xmlns:r="http://schemas.openxmlformats.org/officeDocument/2006/relationships" xmlns:m="http://schemas.openxmlformats.org/officeDocument/2006/math" xmlns:v="urn:schemas-microsoft-com:vml" xmlns:wp14="http://schemas.microsoft.com/office/word/2010/wordprocessingDrawing" xmlns:wp="http://schemas.openxmlformats.org/drawingml/2006/wordprocessingDrawing" xmlns:w10="urn:schemas-microsoft-com:office:word" xmlns:w="http://schemas.openxmlformats.org/wordprocessingml/2006/main" xmlns:w14="http://schemas.microsoft.com/office/word/2010/wordml" xmlns:w15="http://schemas.microsoft.com/office/word/2012/wordml" xmlns:w16cei="http://schemas.microsoft.com/office/word/2026/wordml/cei" xmlns:w16cex="http://schemas.microsoft.com/office/word/2018/wordml/cex" xmlns:w16cid="http://schemas.microsoft.com/office/word/2016/wordml/cid" xmlns:w16="http://schemas.microsoft.com/office/word/2018/wordml" xmlns:w16du="http://schemas.microsoft.com/office/word/2023/wordml/word16du" xmlns:w16sdtdh="http://schemas.microsoft.com/office/word/2020/wordml/sdtdatahash" xmlns:w16sdtfl="http://schemas.microsoft.com/office/word/2024/wordml/sdtformatlock" xmlns:w16se="http://schemas.microsoft.com/office/word/2015/wordml/symex" xmlns:wpg="http://schemas.microsoft.com/office/word/2010/wordprocessingGroup" xmlns:wpi="http://schemas.microsoft.com/office/word/2010/wordprocessingInk" xmlns:wne="http://schemas.microsoft.com/office/word/2006/wordml" xmlns:wps="http://schemas.microsoft.com/office/word/2010/wordprocessingShape" mc:Ignorable="w14 w15 w16se w16cid w16 w16cex w16sdtdh w16sdtfl w16du wp14">
   <w:endnote w:type="separator" w:id="-1">
     <w:p>
       <w:pPr>
@@ -2063,7 +2196,7 @@
 </file>
 
 <file path=word/footnotes.xml><?xml version="1.0" encoding="utf-8"?>
-<w:footnotes xmlns:wpc="http://schemas.microsoft.com/office/word/2010/wordprocessingCanvas" xmlns:cx="http://schemas.microsoft.com/office/drawing/2014/chartex" xmlns:cx1="http://schemas.microsoft.com/office/drawing/2015/9/8/chartex" xmlns:cx2="http://schemas.microsoft.com/office/drawing/2015/10/21/chartex" xmlns:cx3="http://schemas.microsoft.com/office/drawing/2016/5/9/chartex" xmlns:cx4="http://schemas.microsoft.com/office/drawing/2016/5/10/chartex" xmlns:cx5="http://schemas.microsoft.com/office/drawing/2016/5/11/chartex" xmlns:cx6="http://schemas.microsoft.com/office/drawing/2016/5/12/chartex" xmlns:cx7="http://schemas.microsoft.com/office/drawing/2016/5/13/chartex" xmlns:cx8="http://schemas.microsoft.com/office/drawing/2016/5/14/chartex" xmlns:mc="http://schemas.openxmlformats.org/markup-compatibility/2006" xmlns:aink="http://schemas.microsoft.com/office/drawing/2016/ink" xmlns:am3d="http://schemas.microsoft.com/office/drawing/2017/model3d" xmlns:o="urn:schemas-microsoft-com:office:office" xmlns:oel="http://schemas.microsoft.com/office/2019/extlst" xmlns:r="http://schemas.openxmlformats.org/officeDocument/2006/relationships" xmlns:m="http://schemas.openxmlformats.org/officeDocument/2006/math" xmlns:v="urn:schemas-microsoft-com:vml" xmlns:wp14="http://schemas.microsoft.com/office/word/2010/wordprocessingDrawing" xmlns:wp="http://schemas.openxmlformats.org/drawingml/2006/wordprocessingDrawing" xmlns:w10="urn:schemas-microsoft-com:office:word" xmlns:w="http://schemas.openxmlformats.org/wordprocessingml/2006/main" xmlns:w14="http://schemas.microsoft.com/office/word/2010/wordml" xmlns:w15="http://schemas.microsoft.com/office/word/2012/wordml" xmlns:w16cex="http://schemas.microsoft.com/office/word/2018/wordml/cex" xmlns:w16cid="http://schemas.microsoft.com/office/word/2016/wordml/cid" xmlns:w16="http://schemas.microsoft.com/office/word/2018/wordml" xmlns:w16du="http://schemas.microsoft.com/office/word/2023/wordml/word16du" xmlns:w16sdtdh="http://schemas.microsoft.com/office/word/2020/wordml/sdtdatahash" xmlns:w16sdtfl="http://schemas.microsoft.com/office/word/2024/wordml/sdtformatlock" xmlns:w16se="http://schemas.microsoft.com/office/word/2015/wordml/symex" xmlns:wpg="http://schemas.microsoft.com/office/word/2010/wordprocessingGroup" xmlns:wpi="http://schemas.microsoft.com/office/word/2010/wordprocessingInk" xmlns:wne="http://schemas.microsoft.com/office/word/2006/wordml" xmlns:wps="http://schemas.microsoft.com/office/word/2010/wordprocessingShape" mc:Ignorable="w14 w15 w16se w16cid w16 w16cex w16sdtdh w16sdtfl w16du wp14">
+<w:footnotes xmlns:wpc="http://schemas.microsoft.com/office/word/2010/wordprocessingCanvas" xmlns:cx="http://schemas.microsoft.com/office/drawing/2014/chartex" xmlns:cx1="http://schemas.microsoft.com/office/drawing/2015/9/8/chartex" xmlns:cx2="http://schemas.microsoft.com/office/drawing/2015/10/21/chartex" xmlns:cx3="http://schemas.microsoft.com/office/drawing/2016/5/9/chartex" xmlns:cx4="http://schemas.microsoft.com/office/drawing/2016/5/10/chartex" xmlns:cx5="http://schemas.microsoft.com/office/drawing/2016/5/11/chartex" xmlns:cx6="http://schemas.microsoft.com/office/drawing/2016/5/12/chartex" xmlns:cx7="http://schemas.microsoft.com/office/drawing/2016/5/13/chartex" xmlns:cx8="http://schemas.microsoft.com/office/drawing/2016/5/14/chartex" xmlns:mc="http://schemas.openxmlformats.org/markup-compatibility/2006" xmlns:aink="http://schemas.microsoft.com/office/drawing/2016/ink" xmlns:am3d="http://schemas.microsoft.com/office/drawing/2017/model3d" xmlns:o="urn:schemas-microsoft-com:office:office" xmlns:oel="http://schemas.microsoft.com/office/2019/extlst" xmlns:r="http://schemas.openxmlformats.org/officeDocument/2006/relationships" xmlns:m="http://schemas.openxmlformats.org/officeDocument/2006/math" xmlns:v="urn:schemas-microsoft-com:vml" xmlns:wp14="http://schemas.microsoft.com/office/word/2010/wordprocessingDrawing" xmlns:wp="http://schemas.openxmlformats.org/drawingml/2006/wordprocessingDrawing" xmlns:w10="urn:schemas-microsoft-com:office:word" xmlns:w="http://schemas.openxmlformats.org/wordprocessingml/2006/main" xmlns:w14="http://schemas.microsoft.com/office/word/2010/wordml" xmlns:w15="http://schemas.microsoft.com/office/word/2012/wordml" xmlns:w16cei="http://schemas.microsoft.com/office/word/2026/wordml/cei" xmlns:w16cex="http://schemas.microsoft.com/office/word/2018/wordml/cex" xmlns:w16cid="http://schemas.microsoft.com/office/word/2016/wordml/cid" xmlns:w16="http://schemas.microsoft.com/office/word/2018/wordml" xmlns:w16du="http://schemas.microsoft.com/office/word/2023/wordml/word16du" xmlns:w16sdtdh="http://schemas.microsoft.com/office/word/2020/wordml/sdtdatahash" xmlns:w16sdtfl="http://schemas.microsoft.com/office/word/2024/wordml/sdtformatlock" xmlns:w16se="http://schemas.microsoft.com/office/word/2015/wordml/symex" xmlns:wpg="http://schemas.microsoft.com/office/word/2010/wordprocessingGroup" xmlns:wpi="http://schemas.microsoft.com/office/word/2010/wordprocessingInk" xmlns:wne="http://schemas.microsoft.com/office/word/2006/wordml" xmlns:wps="http://schemas.microsoft.com/office/word/2010/wordprocessingShape" mc:Ignorable="w14 w15 w16se w16cid w16 w16cex w16sdtdh w16sdtfl w16du wp14">
   <w:footnote w:type="separator" w:id="-1">
     <w:p>
       <w:pPr>
@@ -2088,7 +2221,7 @@
 </file>
 
 <file path=word/header1.xml><?xml version="1.0" encoding="utf-8"?>
-<w:hdr xmlns:wpc="http://schemas.microsoft.com/office/word/2010/wordprocessingCanvas" xmlns:cx="http://schemas.microsoft.com/office/drawing/2014/chartex" xmlns:cx1="http://schemas.microsoft.com/office/drawing/2015/9/8/chartex" xmlns:cx2="http://schemas.microsoft.com/office/drawing/2015/10/21/chartex" xmlns:cx3="http://schemas.microsoft.com/office/drawing/2016/5/9/chartex" xmlns:cx4="http://schemas.microsoft.com/office/drawing/2016/5/10/chartex" xmlns:cx5="http://schemas.microsoft.com/office/drawing/2016/5/11/chartex" xmlns:cx6="http://schemas.microsoft.com/office/drawing/2016/5/12/chartex" xmlns:cx7="http://schemas.microsoft.com/office/drawing/2016/5/13/chartex" xmlns:cx8="http://schemas.microsoft.com/office/drawing/2016/5/14/chartex" xmlns:mc="http://schemas.openxmlformats.org/markup-compatibility/2006" xmlns:aink="http://schemas.microsoft.com/office/drawing/2016/ink" xmlns:am3d="http://schemas.microsoft.com/office/drawing/2017/model3d" xmlns:o="urn:schemas-microsoft-com:office:office" xmlns:oel="http://schemas.microsoft.com/office/2019/extlst" xmlns:r="http://schemas.openxmlformats.org/officeDocument/2006/relationships" xmlns:m="http://schemas.openxmlformats.org/officeDocument/2006/math" xmlns:v="urn:schemas-microsoft-com:vml" xmlns:wp14="http://schemas.microsoft.com/office/word/2010/wordprocessingDrawing" xmlns:wp="http://schemas.openxmlformats.org/drawingml/2006/wordprocessingDrawing" xmlns:w10="urn:schemas-microsoft-com:office:word" xmlns:w="http://schemas.openxmlformats.org/wordprocessingml/2006/main" xmlns:w14="http://schemas.microsoft.com/office/word/2010/wordml" xmlns:w15="http://schemas.microsoft.com/office/word/2012/wordml" xmlns:w16cex="http://schemas.microsoft.com/office/word/2018/wordml/cex" xmlns:w16cid="http://schemas.microsoft.com/office/word/2016/wordml/cid" xmlns:w16="http://schemas.microsoft.com/office/word/2018/wordml" xmlns:w16du="http://schemas.microsoft.com/office/word/2023/wordml/word16du" xmlns:w16sdtdh="http://schemas.microsoft.com/office/word/2020/wordml/sdtdatahash" xmlns:w16sdtfl="http://schemas.microsoft.com/office/word/2024/wordml/sdtformatlock" xmlns:w16se="http://schemas.microsoft.com/office/word/2015/wordml/symex" xmlns:wpg="http://schemas.microsoft.com/office/word/2010/wordprocessingGroup" xmlns:wpi="http://schemas.microsoft.com/office/word/2010/wordprocessingInk" xmlns:wne="http://schemas.microsoft.com/office/word/2006/wordml" xmlns:wps="http://schemas.microsoft.com/office/word/2010/wordprocessingShape" mc:Ignorable="w14 w15 w16se w16cid w16 w16cex w16sdtdh w16sdtfl w16du wp14">
+<w:hdr xmlns:wpc="http://schemas.microsoft.com/office/word/2010/wordprocessingCanvas" xmlns:cx="http://schemas.microsoft.com/office/drawing/2014/chartex" xmlns:cx1="http://schemas.microsoft.com/office/drawing/2015/9/8/chartex" xmlns:cx2="http://schemas.microsoft.com/office/drawing/2015/10/21/chartex" xmlns:cx3="http://schemas.microsoft.com/office/drawing/2016/5/9/chartex" xmlns:cx4="http://schemas.microsoft.com/office/drawing/2016/5/10/chartex" xmlns:cx5="http://schemas.microsoft.com/office/drawing/2016/5/11/chartex" xmlns:cx6="http://schemas.microsoft.com/office/drawing/2016/5/12/chartex" xmlns:cx7="http://schemas.microsoft.com/office/drawing/2016/5/13/chartex" xmlns:cx8="http://schemas.microsoft.com/office/drawing/2016/5/14/chartex" xmlns:mc="http://schemas.openxmlformats.org/markup-compatibility/2006" xmlns:aink="http://schemas.microsoft.com/office/drawing/2016/ink" xmlns:am3d="http://schemas.microsoft.com/office/drawing/2017/model3d" xmlns:o="urn:schemas-microsoft-com:office:office" xmlns:oel="http://schemas.microsoft.com/office/2019/extlst" xmlns:r="http://schemas.openxmlformats.org/officeDocument/2006/relationships" xmlns:m="http://schemas.openxmlformats.org/officeDocument/2006/math" xmlns:v="urn:schemas-microsoft-com:vml" xmlns:wp14="http://schemas.microsoft.com/office/word/2010/wordprocessingDrawing" xmlns:wp="http://schemas.openxmlformats.org/drawingml/2006/wordprocessingDrawing" xmlns:w10="urn:schemas-microsoft-com:office:word" xmlns:w="http://schemas.openxmlformats.org/wordprocessingml/2006/main" xmlns:w14="http://schemas.microsoft.com/office/word/2010/wordml" xmlns:w15="http://schemas.microsoft.com/office/word/2012/wordml" xmlns:w16cei="http://schemas.microsoft.com/office/word/2026/wordml/cei" xmlns:w16cex="http://schemas.microsoft.com/office/word/2018/wordml/cex" xmlns:w16cid="http://schemas.microsoft.com/office/word/2016/wordml/cid" xmlns:w16="http://schemas.microsoft.com/office/word/2018/wordml" xmlns:w16du="http://schemas.microsoft.com/office/word/2023/wordml/word16du" xmlns:w16sdtdh="http://schemas.microsoft.com/office/word/2020/wordml/sdtdatahash" xmlns:w16sdtfl="http://schemas.microsoft.com/office/word/2024/wordml/sdtformatlock" xmlns:w16se="http://schemas.microsoft.com/office/word/2015/wordml/symex" xmlns:wpg="http://schemas.microsoft.com/office/word/2010/wordprocessingGroup" xmlns:wpi="http://schemas.microsoft.com/office/word/2010/wordprocessingInk" xmlns:wne="http://schemas.microsoft.com/office/word/2006/wordml" xmlns:wps="http://schemas.microsoft.com/office/word/2010/wordprocessingShape" mc:Ignorable="w14 w15 w16se w16cid w16 w16cex w16sdtdh w16sdtfl w16du wp14">
   <w:p>
     <w:pPr>
       <w:widowControl w:val="0"/>
@@ -2532,7 +2665,7 @@
 </file>
 
 <file path=word/numbering.xml><?xml version="1.0" encoding="utf-8"?>
-<w:numbering xmlns:wpc="http://schemas.microsoft.com/office/word/2010/wordprocessingCanvas" xmlns:cx="http://schemas.microsoft.com/office/drawing/2014/chartex" xmlns:cx1="http://schemas.microsoft.com/office/drawing/2015/9/8/chartex" xmlns:cx2="http://schemas.microsoft.com/office/drawing/2015/10/21/chartex" xmlns:cx3="http://schemas.microsoft.com/office/drawing/2016/5/9/chartex" xmlns:cx4="http://schemas.microsoft.com/office/drawing/2016/5/10/chartex" xmlns:cx5="http://schemas.microsoft.com/office/drawing/2016/5/11/chartex" xmlns:cx6="http://schemas.microsoft.com/office/drawing/2016/5/12/chartex" xmlns:cx7="http://schemas.microsoft.com/office/drawing/2016/5/13/chartex" xmlns:cx8="http://schemas.microsoft.com/office/drawing/2016/5/14/chartex" xmlns:mc="http://schemas.openxmlformats.org/markup-compatibility/2006" xmlns:aink="http://schemas.microsoft.com/office/drawing/2016/ink" xmlns:am3d="http://schemas.microsoft.com/office/drawing/2017/model3d" xmlns:o="urn:schemas-microsoft-com:office:office" xmlns:oel="http://schemas.microsoft.com/office/2019/extlst" xmlns:r="http://schemas.openxmlformats.org/officeDocument/2006/relationships" xmlns:m="http://schemas.openxmlformats.org/officeDocument/2006/math" xmlns:v="urn:schemas-microsoft-com:vml" xmlns:wp14="http://schemas.microsoft.com/office/word/2010/wordprocessingDrawing" xmlns:wp="http://schemas.openxmlformats.org/drawingml/2006/wordprocessingDrawing" xmlns:w10="urn:schemas-microsoft-com:office:word" xmlns:w="http://schemas.openxmlformats.org/wordprocessingml/2006/main" xmlns:w14="http://schemas.microsoft.com/office/word/2010/wordml" xmlns:w15="http://schemas.microsoft.com/office/word/2012/wordml" xmlns:w16cex="http://schemas.microsoft.com/office/word/2018/wordml/cex" xmlns:w16cid="http://schemas.microsoft.com/office/word/2016/wordml/cid" xmlns:w16="http://schemas.microsoft.com/office/word/2018/wordml" xmlns:w16du="http://schemas.microsoft.com/office/word/2023/wordml/word16du" xmlns:w16sdtdh="http://schemas.microsoft.com/office/word/2020/wordml/sdtdatahash" xmlns:w16sdtfl="http://schemas.microsoft.com/office/word/2024/wordml/sdtformatlock" xmlns:w16se="http://schemas.microsoft.com/office/word/2015/wordml/symex" xmlns:wpg="http://schemas.microsoft.com/office/word/2010/wordprocessingGroup" xmlns:wpi="http://schemas.microsoft.com/office/word/2010/wordprocessingInk" xmlns:wne="http://schemas.microsoft.com/office/word/2006/wordml" xmlns:wps="http://schemas.microsoft.com/office/word/2010/wordprocessingShape" mc:Ignorable="w14 w15 w16se w16cid w16 w16cex w16sdtdh w16sdtfl w16du wp14">
+<w:numbering xmlns:wpc="http://schemas.microsoft.com/office/word/2010/wordprocessingCanvas" xmlns:cx="http://schemas.microsoft.com/office/drawing/2014/chartex" xmlns:cx1="http://schemas.microsoft.com/office/drawing/2015/9/8/chartex" xmlns:cx2="http://schemas.microsoft.com/office/drawing/2015/10/21/chartex" xmlns:cx3="http://schemas.microsoft.com/office/drawing/2016/5/9/chartex" xmlns:cx4="http://schemas.microsoft.com/office/drawing/2016/5/10/chartex" xmlns:cx5="http://schemas.microsoft.com/office/drawing/2016/5/11/chartex" xmlns:cx6="http://schemas.microsoft.com/office/drawing/2016/5/12/chartex" xmlns:cx7="http://schemas.microsoft.com/office/drawing/2016/5/13/chartex" xmlns:cx8="http://schemas.microsoft.com/office/drawing/2016/5/14/chartex" xmlns:mc="http://schemas.openxmlformats.org/markup-compatibility/2006" xmlns:aink="http://schemas.microsoft.com/office/drawing/2016/ink" xmlns:am3d="http://schemas.microsoft.com/office/drawing/2017/model3d" xmlns:o="urn:schemas-microsoft-com:office:office" xmlns:oel="http://schemas.microsoft.com/office/2019/extlst" xmlns:r="http://schemas.openxmlformats.org/officeDocument/2006/relationships" xmlns:m="http://schemas.openxmlformats.org/officeDocument/2006/math" xmlns:v="urn:schemas-microsoft-com:vml" xmlns:wp14="http://schemas.microsoft.com/office/word/2010/wordprocessingDrawing" xmlns:wp="http://schemas.openxmlformats.org/drawingml/2006/wordprocessingDrawing" xmlns:w10="urn:schemas-microsoft-com:office:word" xmlns:w="http://schemas.openxmlformats.org/wordprocessingml/2006/main" xmlns:w14="http://schemas.microsoft.com/office/word/2010/wordml" xmlns:w15="http://schemas.microsoft.com/office/word/2012/wordml" xmlns:w16cei="http://schemas.microsoft.com/office/word/2026/wordml/cei" xmlns:w16cex="http://schemas.microsoft.com/office/word/2018/wordml/cex" xmlns:w16cid="http://schemas.microsoft.com/office/word/2016/wordml/cid" xmlns:w16="http://schemas.microsoft.com/office/word/2018/wordml" xmlns:w16du="http://schemas.microsoft.com/office/word/2023/wordml/word16du" xmlns:w16sdtdh="http://schemas.microsoft.com/office/word/2020/wordml/sdtdatahash" xmlns:w16sdtfl="http://schemas.microsoft.com/office/word/2024/wordml/sdtformatlock" xmlns:w16se="http://schemas.microsoft.com/office/word/2015/wordml/symex" xmlns:wpg="http://schemas.microsoft.com/office/word/2010/wordprocessingGroup" xmlns:wpi="http://schemas.microsoft.com/office/word/2010/wordprocessingInk" xmlns:wne="http://schemas.microsoft.com/office/word/2006/wordml" xmlns:wps="http://schemas.microsoft.com/office/word/2010/wordprocessingShape" mc:Ignorable="w14 w15 w16se w16cid w16 w16cex w16sdtdh w16sdtfl w16du wp14">
   <w:abstractNum w:abstractNumId="0" w15:restartNumberingAfterBreak="0">
     <w:nsid w:val="11577376"/>
     <w:multiLevelType w:val="multilevel"/>

</xml_diff>